<commit_message>
fix(ha-vi): v6 snapshot — UBCC fixes + docs/evidence sync
</commit_message>
<xml_diff>
--- a/docs/design/cc_ep_deliverable2_verification_reliability_ha.docx
+++ b/docs/design/cc_ep_deliverable2_verification_reliability_ha.docx
@@ -117,7 +117,7 @@
         <w:rPr>
           <w:rFonts w:ascii="Calibri" w:hAnsi="Calibri" w:eastAsia="Microsoft YaHei" w:cs="Calibri"/>
         </w:rPr>
-        <w:t xml:space="preserve">8. 交付内容</w:t>
+        <w:t xml:space="preserve">8. 验证规模与范围对照</w:t>
       </w:r>
     </w:p>
     <w:p>
@@ -128,7 +128,7 @@
         <w:rPr>
           <w:rFonts w:ascii="Calibri" w:hAnsi="Calibri" w:eastAsia="Microsoft YaHei" w:cs="Calibri"/>
         </w:rPr>
-        <w:t xml:space="preserve">9. 总结</w:t>
+        <w:t xml:space="preserve">9. 交付内容</w:t>
       </w:r>
     </w:p>
     <w:p>
@@ -139,6 +139,17 @@
         <w:rPr>
           <w:rFonts w:ascii="Calibri" w:hAnsi="Calibri" w:eastAsia="Microsoft YaHei" w:cs="Calibri"/>
         </w:rPr>
+        <w:t xml:space="preserve">10. 总结</w:t>
+      </w:r>
+    </w:p>
+    <w:p>
+      <w:pPr>
+        <w:ind w:left="0" w:firstLine="420"/>
+      </w:pPr>
+      <w:r>
+        <w:rPr>
+          <w:rFonts w:ascii="Calibri" w:hAnsi="Calibri" w:eastAsia="Microsoft YaHei" w:cs="Calibri"/>
+        </w:rPr>
         <w:t xml:space="preserve">附录 A 形式化模型清单</w:t>
       </w:r>
     </w:p>
@@ -173,6 +184,17 @@
           <w:rFonts w:ascii="Calibri" w:hAnsi="Calibri" w:eastAsia="Microsoft YaHei" w:cs="Calibri"/>
         </w:rPr>
         <w:t xml:space="preserve">附录 D 术语表</w:t>
+      </w:r>
+    </w:p>
+    <w:p>
+      <w:pPr>
+        <w:ind w:left="0" w:firstLine="420"/>
+      </w:pPr>
+      <w:r>
+        <w:rPr>
+          <w:rFonts w:ascii="Calibri" w:hAnsi="Calibri" w:eastAsia="Microsoft YaHei" w:cs="Calibri"/>
+        </w:rPr>
+        <w:t xml:space="preserve">附录 E 参考文献</w:t>
       </w:r>
     </w:p>
     <w:p>
@@ -1236,7 +1258,7 @@
                 <w:sz w:val="18"/>
                 <w:szCs w:val="18"/>
               </w:rPr>
-              <w:t xml:space="preserve">协议实现、定向机制测试、O3、多拓扑、性能正确性测试和 Q1-Q5</w:t>
+              <w:t xml:space="preserve">协议实现、定向机制测试、O3、多拓扑、性能正确性测试和 G1–G5</w:t>
             </w:r>
           </w:p>
         </w:tc>
@@ -3925,7 +3947,7 @@
                 <w:sz w:val="18"/>
                 <w:szCs w:val="18"/>
               </w:rPr>
-              <w:t xml:space="preserve">Q1-Q3</w:t>
+              <w:t xml:space="preserve">G1–G3</w:t>
             </w:r>
           </w:p>
         </w:tc>
@@ -4018,7 +4040,7 @@
                 <w:sz w:val="18"/>
                 <w:szCs w:val="18"/>
               </w:rPr>
-              <w:t xml:space="preserve">Q1、Q4</w:t>
+              <w:t xml:space="preserve">G1、G4</w:t>
             </w:r>
           </w:p>
         </w:tc>
@@ -4111,7 +4133,7 @@
                 <w:sz w:val="18"/>
                 <w:szCs w:val="18"/>
               </w:rPr>
-              <w:t xml:space="preserve">Q1、Q3、Q5</w:t>
+              <w:t xml:space="preserve">G1、G3、G5</w:t>
             </w:r>
           </w:p>
         </w:tc>
@@ -4204,7 +4226,7 @@
                 <w:sz w:val="18"/>
                 <w:szCs w:val="18"/>
               </w:rPr>
-              <w:t xml:space="preserve">Q1、Q4</w:t>
+              <w:t xml:space="preserve">G1、G4</w:t>
             </w:r>
           </w:p>
         </w:tc>
@@ -4293,7 +4315,7 @@
                 <w:sz w:val="18"/>
                 <w:szCs w:val="18"/>
               </w:rPr>
-              <w:t xml:space="preserve">Q4</w:t>
+              <w:t xml:space="preserve">G4</w:t>
             </w:r>
           </w:p>
         </w:tc>
@@ -4425,10 +4447,10 @@
         </w:tblCellMar>
       </w:tblPr>
       <w:tblGrid>
-        <w:gridCol w:w="1457"/>
-        <w:gridCol w:w="1457"/>
-        <w:gridCol w:w="4957"/>
-        <w:gridCol w:w="1726"/>
+        <w:gridCol w:w="1900"/>
+        <w:gridCol w:w="1400"/>
+        <w:gridCol w:w="4650"/>
+        <w:gridCol w:w="1650"/>
       </w:tblGrid>
       <w:tr>
         <w:trPr>
@@ -4437,7 +4459,7 @@
         </w:trPr>
         <w:tc>
           <w:tcPr>
-            <w:tcW w:w="1457" w:type="dxa"/>
+            <w:tcW w:w="1900" w:type="dxa"/>
             <w:shd w:val="clear" w:color="auto" w:fill="D9E2F3"/>
           </w:tcPr>
           <w:p>
@@ -4461,7 +4483,7 @@
         </w:tc>
         <w:tc>
           <w:tcPr>
-            <w:tcW w:w="1457" w:type="dxa"/>
+            <w:tcW w:w="1400" w:type="dxa"/>
             <w:shd w:val="clear" w:color="auto" w:fill="D9E2F3"/>
           </w:tcPr>
           <w:p>
@@ -4485,7 +4507,7 @@
         </w:tc>
         <w:tc>
           <w:tcPr>
-            <w:tcW w:w="4957" w:type="dxa"/>
+            <w:tcW w:w="4650" w:type="dxa"/>
             <w:shd w:val="clear" w:color="auto" w:fill="D9E2F3"/>
           </w:tcPr>
           <w:p>
@@ -4509,7 +4531,7 @@
         </w:tc>
         <w:tc>
           <w:tcPr>
-            <w:tcW w:w="1726" w:type="dxa"/>
+            <w:tcW w:w="1650" w:type="dxa"/>
             <w:shd w:val="clear" w:color="auto" w:fill="D9E2F3"/>
           </w:tcPr>
           <w:p>
@@ -4538,29 +4560,29 @@
         </w:trPr>
         <w:tc>
           <w:tcPr>
-            <w:tcW w:w="1457" w:type="dxa"/>
-          </w:tcPr>
-          <w:p>
-            <w:pPr>
-              <w:pStyle w:val="TableText"/>
-              <w:jc w:val="left"/>
-              <w:wordWrap w:val="0"/>
-              <w:keepNext/>
-              <w:spacing w:before="0" w:after="0" w:line="320" w:lineRule="exact"/>
-            </w:pPr>
-            <w:r>
-              <w:rPr>
-                <w:rFonts w:ascii="Calibri" w:hAnsi="Calibri" w:eastAsia="Microsoft YaHei" w:cs="Calibri"/>
-                <w:sz w:val="18"/>
-                <w:szCs w:val="18"/>
-              </w:rPr>
-              <w:t xml:space="preserve">Q1</w:t>
-            </w:r>
-          </w:p>
-        </w:tc>
-        <w:tc>
-          <w:tcPr>
-            <w:tcW w:w="1457" w:type="dxa"/>
+            <w:tcW w:w="1900" w:type="dxa"/>
+          </w:tcPr>
+          <w:p>
+            <w:pPr>
+              <w:pStyle w:val="TableText"/>
+              <w:jc w:val="left"/>
+              <w:wordWrap w:val="0"/>
+              <w:keepNext/>
+              <w:spacing w:before="0" w:after="0" w:line="320" w:lineRule="exact"/>
+            </w:pPr>
+            <w:r>
+              <w:rPr>
+                <w:rFonts w:ascii="Calibri" w:hAnsi="Calibri" w:eastAsia="Microsoft YaHei" w:cs="Calibri"/>
+                <w:sz w:val="18"/>
+                <w:szCs w:val="18"/>
+              </w:rPr>
+              <w:t xml:space="preserve">G1 单消息传输故障</w:t>
+            </w:r>
+          </w:p>
+        </w:tc>
+        <w:tc>
+          <w:tcPr>
+            <w:tcW w:w="1400" w:type="dxa"/>
           </w:tcPr>
           <w:p>
             <w:pPr>
@@ -4582,29 +4604,29 @@
         </w:tc>
         <w:tc>
           <w:tcPr>
-            <w:tcW w:w="4957" w:type="dxa"/>
-          </w:tcPr>
-          <w:p>
-            <w:pPr>
-              <w:pStyle w:val="TableText"/>
-              <w:jc w:val="left"/>
-              <w:wordWrap w:val="0"/>
-              <w:keepNext/>
-              <w:spacing w:before="0" w:after="0" w:line="320" w:lineRule="exact"/>
-            </w:pPr>
-            <w:r>
-              <w:rPr>
-                <w:rFonts w:ascii="Calibri" w:hAnsi="Calibri" w:eastAsia="Microsoft YaHei" w:cs="Calibri"/>
-                <w:sz w:val="18"/>
-                <w:szCs w:val="18"/>
-              </w:rPr>
-              <w:t xml:space="preserve">基础消息故障集合</w:t>
-            </w:r>
-          </w:p>
-        </w:tc>
-        <w:tc>
-          <w:tcPr>
-            <w:tcW w:w="1726" w:type="dxa"/>
+            <w:tcW w:w="4650" w:type="dxa"/>
+          </w:tcPr>
+          <w:p>
+            <w:pPr>
+              <w:pStyle w:val="TableText"/>
+              <w:jc w:val="left"/>
+              <w:wordWrap w:val="0"/>
+              <w:keepNext/>
+              <w:spacing w:before="0" w:after="0" w:line="320" w:lineRule="exact"/>
+            </w:pPr>
+            <w:r>
+              <w:rPr>
+                <w:rFonts w:ascii="Calibri" w:hAnsi="Calibri" w:eastAsia="Microsoft YaHei" w:cs="Calibri"/>
+                <w:sz w:val="18"/>
+                <w:szCs w:val="18"/>
+              </w:rPr>
+              <w:t xml:space="preserve">单条消息的丢失、延迟、重复、乱序</w:t>
+            </w:r>
+          </w:p>
+        </w:tc>
+        <w:tc>
+          <w:tcPr>
+            <w:tcW w:w="1650" w:type="dxa"/>
           </w:tcPr>
           <w:p>
             <w:pPr>
@@ -4631,29 +4653,29 @@
         </w:trPr>
         <w:tc>
           <w:tcPr>
-            <w:tcW w:w="1457" w:type="dxa"/>
-          </w:tcPr>
-          <w:p>
-            <w:pPr>
-              <w:pStyle w:val="TableText"/>
-              <w:jc w:val="left"/>
-              <w:wordWrap w:val="0"/>
-              <w:keepNext/>
-              <w:spacing w:before="0" w:after="0" w:line="320" w:lineRule="exact"/>
-            </w:pPr>
-            <w:r>
-              <w:rPr>
-                <w:rFonts w:ascii="Calibri" w:hAnsi="Calibri" w:eastAsia="Microsoft YaHei" w:cs="Calibri"/>
-                <w:sz w:val="18"/>
-                <w:szCs w:val="18"/>
-              </w:rPr>
-              <w:t xml:space="preserve">Q2</w:t>
-            </w:r>
-          </w:p>
-        </w:tc>
-        <w:tc>
-          <w:tcPr>
-            <w:tcW w:w="1457" w:type="dxa"/>
+            <w:tcW w:w="1900" w:type="dxa"/>
+          </w:tcPr>
+          <w:p>
+            <w:pPr>
+              <w:pStyle w:val="TableText"/>
+              <w:jc w:val="left"/>
+              <w:wordWrap w:val="0"/>
+              <w:keepNext/>
+              <w:spacing w:before="0" w:after="0" w:line="320" w:lineRule="exact"/>
+            </w:pPr>
+            <w:r>
+              <w:rPr>
+                <w:rFonts w:ascii="Calibri" w:hAnsi="Calibri" w:eastAsia="Microsoft YaHei" w:cs="Calibri"/>
+                <w:sz w:val="18"/>
+                <w:szCs w:val="18"/>
+              </w:rPr>
+              <w:t xml:space="preserve">G2 连续丢失故障</w:t>
+            </w:r>
+          </w:p>
+        </w:tc>
+        <w:tc>
+          <w:tcPr>
+            <w:tcW w:w="1400" w:type="dxa"/>
           </w:tcPr>
           <w:p>
             <w:pPr>
@@ -4675,7 +4697,7 @@
         </w:tc>
         <w:tc>
           <w:tcPr>
-            <w:tcW w:w="4957" w:type="dxa"/>
+            <w:tcW w:w="4650" w:type="dxa"/>
           </w:tcPr>
           <w:p>
             <w:pPr>
@@ -4691,13 +4713,13 @@
                 <w:sz w:val="16"/>
                 <w:szCs w:val="16"/>
               </w:rPr>
-              <w:t xml:space="preserve">Clear、Upgrade、InvalidateAck、RecallResp 连续丢失</w:t>
-            </w:r>
-          </w:p>
-        </w:tc>
-        <w:tc>
-          <w:tcPr>
-            <w:tcW w:w="1726" w:type="dxa"/>
+              <w:t xml:space="preserve">Clear、UpgradeReq、InvalidateAck、RecallResp 连续丢失</w:t>
+            </w:r>
+          </w:p>
+        </w:tc>
+        <w:tc>
+          <w:tcPr>
+            <w:tcW w:w="1650" w:type="dxa"/>
           </w:tcPr>
           <w:p>
             <w:pPr>
@@ -4724,29 +4746,29 @@
         </w:trPr>
         <w:tc>
           <w:tcPr>
-            <w:tcW w:w="1457" w:type="dxa"/>
-          </w:tcPr>
-          <w:p>
-            <w:pPr>
-              <w:pStyle w:val="TableText"/>
-              <w:jc w:val="left"/>
-              <w:wordWrap w:val="0"/>
-              <w:keepNext/>
-              <w:spacing w:before="0" w:after="0" w:line="320" w:lineRule="exact"/>
-            </w:pPr>
-            <w:r>
-              <w:rPr>
-                <w:rFonts w:ascii="Calibri" w:hAnsi="Calibri" w:eastAsia="Microsoft YaHei" w:cs="Calibri"/>
-                <w:sz w:val="18"/>
-                <w:szCs w:val="18"/>
-              </w:rPr>
-              <w:t xml:space="preserve">Q3</w:t>
-            </w:r>
-          </w:p>
-        </w:tc>
-        <w:tc>
-          <w:tcPr>
-            <w:tcW w:w="1457" w:type="dxa"/>
+            <w:tcW w:w="1900" w:type="dxa"/>
+          </w:tcPr>
+          <w:p>
+            <w:pPr>
+              <w:pStyle w:val="TableText"/>
+              <w:jc w:val="left"/>
+              <w:wordWrap w:val="0"/>
+              <w:keepNext/>
+              <w:spacing w:before="0" w:after="0" w:line="320" w:lineRule="exact"/>
+            </w:pPr>
+            <w:r>
+              <w:rPr>
+                <w:rFonts w:ascii="Calibri" w:hAnsi="Calibri" w:eastAsia="Microsoft YaHei" w:cs="Calibri"/>
+                <w:sz w:val="18"/>
+                <w:szCs w:val="18"/>
+              </w:rPr>
+              <w:t xml:space="preserve">G3 成对依赖故障</w:t>
+            </w:r>
+          </w:p>
+        </w:tc>
+        <w:tc>
+          <w:tcPr>
+            <w:tcW w:w="1400" w:type="dxa"/>
           </w:tcPr>
           <w:p>
             <w:pPr>
@@ -4768,29 +4790,29 @@
         </w:tc>
         <w:tc>
           <w:tcPr>
-            <w:tcW w:w="4957" w:type="dxa"/>
-          </w:tcPr>
-          <w:p>
-            <w:pPr>
-              <w:pStyle w:val="TableText"/>
-              <w:jc w:val="left"/>
-              <w:wordWrap w:val="0"/>
-              <w:keepNext/>
-              <w:spacing w:before="0" w:after="0" w:line="320" w:lineRule="exact"/>
-            </w:pPr>
-            <w:r>
-              <w:rPr>
-                <w:rFonts w:ascii="Calibri" w:hAnsi="Calibri" w:eastAsia="Microsoft YaHei" w:cs="Calibri"/>
-                <w:sz w:val="18"/>
-                <w:szCs w:val="18"/>
-              </w:rPr>
-              <w:t xml:space="preserve">请求与响应的双故障组合</w:t>
-            </w:r>
-          </w:p>
-        </w:tc>
-        <w:tc>
-          <w:tcPr>
-            <w:tcW w:w="1726" w:type="dxa"/>
+            <w:tcW w:w="4650" w:type="dxa"/>
+          </w:tcPr>
+          <w:p>
+            <w:pPr>
+              <w:pStyle w:val="TableText"/>
+              <w:jc w:val="left"/>
+              <w:wordWrap w:val="0"/>
+              <w:keepNext/>
+              <w:spacing w:before="0" w:after="0" w:line="320" w:lineRule="exact"/>
+            </w:pPr>
+            <w:r>
+              <w:rPr>
+                <w:rFonts w:ascii="Calibri" w:hAnsi="Calibri" w:eastAsia="Microsoft YaHei" w:cs="Calibri"/>
+                <w:sz w:val="18"/>
+                <w:szCs w:val="18"/>
+              </w:rPr>
+              <w:t xml:space="preserve">请求与响应的成对故障</w:t>
+            </w:r>
+          </w:p>
+        </w:tc>
+        <w:tc>
+          <w:tcPr>
+            <w:tcW w:w="1650" w:type="dxa"/>
           </w:tcPr>
           <w:p>
             <w:pPr>
@@ -4817,29 +4839,29 @@
         </w:trPr>
         <w:tc>
           <w:tcPr>
-            <w:tcW w:w="1457" w:type="dxa"/>
-          </w:tcPr>
-          <w:p>
-            <w:pPr>
-              <w:pStyle w:val="TableText"/>
-              <w:jc w:val="left"/>
-              <w:wordWrap w:val="0"/>
-              <w:keepNext/>
-              <w:spacing w:before="0" w:after="0" w:line="320" w:lineRule="exact"/>
-            </w:pPr>
-            <w:r>
-              <w:rPr>
-                <w:rFonts w:ascii="Calibri" w:hAnsi="Calibri" w:eastAsia="Microsoft YaHei" w:cs="Calibri"/>
-                <w:sz w:val="18"/>
-                <w:szCs w:val="18"/>
-              </w:rPr>
-              <w:t xml:space="preserve">Q4</w:t>
-            </w:r>
-          </w:p>
-        </w:tc>
-        <w:tc>
-          <w:tcPr>
-            <w:tcW w:w="1457" w:type="dxa"/>
+            <w:tcW w:w="1900" w:type="dxa"/>
+          </w:tcPr>
+          <w:p>
+            <w:pPr>
+              <w:pStyle w:val="TableText"/>
+              <w:jc w:val="left"/>
+              <w:wordWrap w:val="0"/>
+              <w:keepNext/>
+              <w:spacing w:before="0" w:after="0" w:line="320" w:lineRule="exact"/>
+            </w:pPr>
+            <w:r>
+              <w:rPr>
+                <w:rFonts w:ascii="Calibri" w:hAnsi="Calibri" w:eastAsia="Microsoft YaHei" w:cs="Calibri"/>
+                <w:sz w:val="18"/>
+                <w:szCs w:val="18"/>
+              </w:rPr>
+              <w:t xml:space="preserve">G4 并发与聚合故障</w:t>
+            </w:r>
+          </w:p>
+        </w:tc>
+        <w:tc>
+          <w:tcPr>
+            <w:tcW w:w="1400" w:type="dxa"/>
           </w:tcPr>
           <w:p>
             <w:pPr>
@@ -4861,7 +4883,7 @@
         </w:tc>
         <w:tc>
           <w:tcPr>
-            <w:tcW w:w="4957" w:type="dxa"/>
+            <w:tcW w:w="4650" w:type="dxa"/>
           </w:tcPr>
           <w:p>
             <w:pPr>
@@ -4883,7 +4905,7 @@
         </w:tc>
         <w:tc>
           <w:tcPr>
-            <w:tcW w:w="1726" w:type="dxa"/>
+            <w:tcW w:w="1650" w:type="dxa"/>
           </w:tcPr>
           <w:p>
             <w:pPr>
@@ -4910,29 +4932,29 @@
         </w:trPr>
         <w:tc>
           <w:tcPr>
-            <w:tcW w:w="1457" w:type="dxa"/>
-          </w:tcPr>
-          <w:p>
-            <w:pPr>
-              <w:pStyle w:val="TableText"/>
-              <w:jc w:val="left"/>
-              <w:wordWrap w:val="0"/>
-              <w:keepNext/>
-              <w:spacing w:before="0" w:after="0" w:line="320" w:lineRule="exact"/>
-            </w:pPr>
-            <w:r>
-              <w:rPr>
-                <w:rFonts w:ascii="Calibri" w:hAnsi="Calibri" w:eastAsia="Microsoft YaHei" w:cs="Calibri"/>
-                <w:sz w:val="18"/>
-                <w:szCs w:val="18"/>
-              </w:rPr>
-              <w:t xml:space="preserve">Q5</w:t>
-            </w:r>
-          </w:p>
-        </w:tc>
-        <w:tc>
-          <w:tcPr>
-            <w:tcW w:w="1457" w:type="dxa"/>
+            <w:tcW w:w="1900" w:type="dxa"/>
+          </w:tcPr>
+          <w:p>
+            <w:pPr>
+              <w:pStyle w:val="TableText"/>
+              <w:jc w:val="left"/>
+              <w:wordWrap w:val="0"/>
+              <w:keepNext/>
+              <w:spacing w:before="0" w:after="0" w:line="320" w:lineRule="exact"/>
+            </w:pPr>
+            <w:r>
+              <w:rPr>
+                <w:rFonts w:ascii="Calibri" w:hAnsi="Calibri" w:eastAsia="Microsoft YaHei" w:cs="Calibri"/>
+                <w:sz w:val="18"/>
+                <w:szCs w:val="18"/>
+              </w:rPr>
+              <w:t xml:space="preserve">G5 多拓扑故障</w:t>
+            </w:r>
+          </w:p>
+        </w:tc>
+        <w:tc>
+          <w:tcPr>
+            <w:tcW w:w="1400" w:type="dxa"/>
           </w:tcPr>
           <w:p>
             <w:pPr>
@@ -4954,7 +4976,7 @@
         </w:tc>
         <w:tc>
           <w:tcPr>
-            <w:tcW w:w="4957" w:type="dxa"/>
+            <w:tcW w:w="4650" w:type="dxa"/>
           </w:tcPr>
           <w:p>
             <w:pPr>
@@ -4976,7 +4998,7 @@
         </w:tc>
         <w:tc>
           <w:tcPr>
-            <w:tcW w:w="1726" w:type="dxa"/>
+            <w:tcW w:w="1650" w:type="dxa"/>
           </w:tcPr>
           <w:p>
             <w:pPr>
@@ -5003,7 +5025,7 @@
         </w:trPr>
         <w:tc>
           <w:tcPr>
-            <w:tcW w:w="1457" w:type="dxa"/>
+            <w:tcW w:w="1900" w:type="dxa"/>
           </w:tcPr>
           <w:p>
             <w:pPr>
@@ -5024,7 +5046,7 @@
         </w:tc>
         <w:tc>
           <w:tcPr>
-            <w:tcW w:w="1457" w:type="dxa"/>
+            <w:tcW w:w="1400" w:type="dxa"/>
           </w:tcPr>
           <w:p>
             <w:pPr>
@@ -5045,28 +5067,28 @@
         </w:tc>
         <w:tc>
           <w:tcPr>
-            <w:tcW w:w="4957" w:type="dxa"/>
-          </w:tcPr>
-          <w:p>
-            <w:pPr>
-              <w:pStyle w:val="TableText"/>
-              <w:jc w:val="left"/>
-              <w:wordWrap w:val="0"/>
-              <w:spacing w:before="0" w:after="0" w:line="320" w:lineRule="exact"/>
-            </w:pPr>
-            <w:r>
-              <w:rPr>
-                <w:rFonts w:ascii="Calibri" w:hAnsi="Calibri" w:eastAsia="Microsoft YaHei" w:cs="Calibri"/>
-                <w:sz w:val="18"/>
-                <w:szCs w:val="18"/>
-              </w:rPr>
-              <w:t xml:space="preserve">Q1-Q5</w:t>
-            </w:r>
-          </w:p>
-        </w:tc>
-        <w:tc>
-          <w:tcPr>
-            <w:tcW w:w="1726" w:type="dxa"/>
+            <w:tcW w:w="4650" w:type="dxa"/>
+          </w:tcPr>
+          <w:p>
+            <w:pPr>
+              <w:pStyle w:val="TableText"/>
+              <w:jc w:val="left"/>
+              <w:wordWrap w:val="0"/>
+              <w:spacing w:before="0" w:after="0" w:line="320" w:lineRule="exact"/>
+            </w:pPr>
+            <w:r>
+              <w:rPr>
+                <w:rFonts w:ascii="Calibri" w:hAnsi="Calibri" w:eastAsia="Microsoft YaHei" w:cs="Calibri"/>
+                <w:sz w:val="18"/>
+                <w:szCs w:val="18"/>
+              </w:rPr>
+              <w:t xml:space="preserve">G1–G5</w:t>
+            </w:r>
+          </w:p>
+        </w:tc>
+        <w:tc>
+          <w:tcPr>
+            <w:tcW w:w="1650" w:type="dxa"/>
           </w:tcPr>
           <w:p>
             <w:pPr>
@@ -5095,9 +5117,372 @@
         <w:rPr>
           <w:rFonts w:ascii="Calibri" w:hAnsi="Calibri" w:eastAsia="Microsoft YaHei" w:cs="Calibri"/>
         </w:rPr>
-        <w:t xml:space="preserve">五组共 52 项仿真测试，最终结果为 52/52 通过。</w:t>
-      </w:r>
-    </w:p>
+        <w:t xml:space="preserve">五组共 52 项仿真测试，最终结果为 52/52 通过。用例编号采用“组-动作-对象”格式（动作取 LOSS、DELAY、DUP、REORDER），例如 G1-LOSS-Clear、G2-LOSS-UpgradeReq、 G3-PAIR-Recall、G4-AGG-PartialAck、G5-TOPO-16N1S，使每条用例的故障域、故障动作与作用对象都可从编号直接读出。故障注入的分类维度如下：</w:t>
+      </w:r>
+    </w:p>
+    <w:tbl>
+      <w:tblPr>
+        <w:tblStyle w:val="TableGrid"/>
+        <w:tblW w:w="5000" w:type="pct"/>
+        <w:tblLayout w:type="fixed"/>
+        <w:tblCellMar>
+          <w:top w:w="60" w:type="dxa"/>
+          <w:left w:w="90" w:type="dxa"/>
+          <w:bottom w:w="60" w:type="dxa"/>
+          <w:right w:w="90" w:type="dxa"/>
+        </w:tblCellMar>
+      </w:tblPr>
+      <w:tblGrid>
+        <w:gridCol w:w="1960"/>
+        <w:gridCol w:w="7639"/>
+      </w:tblGrid>
+      <w:tr>
+        <w:trPr>
+          <w:cantSplit/>
+          <w:tblHeader/>
+        </w:trPr>
+        <w:tc>
+          <w:tcPr>
+            <w:tcW w:w="1960" w:type="dxa"/>
+            <w:shd w:val="clear" w:color="auto" w:fill="D9E2F3"/>
+          </w:tcPr>
+          <w:p>
+            <w:pPr>
+              <w:pStyle w:val="TableText"/>
+              <w:jc w:val="left"/>
+              <w:wordWrap w:val="0"/>
+              <w:keepNext/>
+              <w:spacing w:before="0" w:after="0" w:line="320" w:lineRule="exact"/>
+            </w:pPr>
+            <w:r>
+              <w:rPr>
+                <w:rFonts w:ascii="Calibri" w:hAnsi="Calibri" w:eastAsia="SimHei" w:cs="Calibri"/>
+                <w:b/>
+                <w:sz w:val="18"/>
+                <w:szCs w:val="18"/>
+              </w:rPr>
+              <w:t xml:space="preserve">维度</w:t>
+            </w:r>
+          </w:p>
+        </w:tc>
+        <w:tc>
+          <w:tcPr>
+            <w:tcW w:w="7639" w:type="dxa"/>
+            <w:shd w:val="clear" w:color="auto" w:fill="D9E2F3"/>
+          </w:tcPr>
+          <w:p>
+            <w:pPr>
+              <w:pStyle w:val="TableText"/>
+              <w:jc w:val="left"/>
+              <w:wordWrap w:val="0"/>
+              <w:keepNext/>
+              <w:spacing w:before="0" w:after="0" w:line="320" w:lineRule="exact"/>
+            </w:pPr>
+            <w:r>
+              <w:rPr>
+                <w:rFonts w:ascii="Calibri" w:hAnsi="Calibri" w:eastAsia="SimHei" w:cs="Calibri"/>
+                <w:b/>
+                <w:sz w:val="18"/>
+                <w:szCs w:val="18"/>
+              </w:rPr>
+              <w:t xml:space="preserve">取值</w:t>
+            </w:r>
+          </w:p>
+        </w:tc>
+      </w:tr>
+      <w:tr>
+        <w:trPr>
+          <w:cantSplit/>
+        </w:trPr>
+        <w:tc>
+          <w:tcPr>
+            <w:tcW w:w="1960" w:type="dxa"/>
+          </w:tcPr>
+          <w:p>
+            <w:pPr>
+              <w:pStyle w:val="TableText"/>
+              <w:jc w:val="left"/>
+              <w:wordWrap w:val="0"/>
+              <w:keepNext/>
+              <w:spacing w:before="0" w:after="0" w:line="320" w:lineRule="exact"/>
+            </w:pPr>
+            <w:r>
+              <w:rPr>
+                <w:rFonts w:ascii="Calibri" w:hAnsi="Calibri" w:eastAsia="Microsoft YaHei" w:cs="Calibri"/>
+                <w:sz w:val="18"/>
+                <w:szCs w:val="18"/>
+              </w:rPr>
+              <w:t xml:space="preserve">故障动作</w:t>
+            </w:r>
+          </w:p>
+        </w:tc>
+        <w:tc>
+          <w:tcPr>
+            <w:tcW w:w="7639" w:type="dxa"/>
+          </w:tcPr>
+          <w:p>
+            <w:pPr>
+              <w:pStyle w:val="TableText"/>
+              <w:jc w:val="left"/>
+              <w:wordWrap w:val="0"/>
+              <w:keepNext/>
+              <w:spacing w:before="0" w:after="0" w:line="320" w:lineRule="exact"/>
+            </w:pPr>
+            <w:r>
+              <w:rPr>
+                <w:rFonts w:ascii="Calibri" w:hAnsi="Calibri" w:eastAsia="Microsoft YaHei" w:cs="Calibri"/>
+                <w:sz w:val="18"/>
+                <w:szCs w:val="18"/>
+              </w:rPr>
+              <w:t xml:space="preserve">丢失、延迟、重复、乱序</w:t>
+            </w:r>
+          </w:p>
+        </w:tc>
+      </w:tr>
+      <w:tr>
+        <w:trPr>
+          <w:cantSplit/>
+        </w:trPr>
+        <w:tc>
+          <w:tcPr>
+            <w:tcW w:w="1960" w:type="dxa"/>
+          </w:tcPr>
+          <w:p>
+            <w:pPr>
+              <w:pStyle w:val="TableText"/>
+              <w:jc w:val="left"/>
+              <w:wordWrap w:val="0"/>
+              <w:keepNext/>
+              <w:spacing w:before="0" w:after="0" w:line="320" w:lineRule="exact"/>
+            </w:pPr>
+            <w:r>
+              <w:rPr>
+                <w:rFonts w:ascii="Calibri" w:hAnsi="Calibri" w:eastAsia="Microsoft YaHei" w:cs="Calibri"/>
+                <w:sz w:val="18"/>
+                <w:szCs w:val="18"/>
+              </w:rPr>
+              <w:t xml:space="preserve">作用对象</w:t>
+            </w:r>
+          </w:p>
+        </w:tc>
+        <w:tc>
+          <w:tcPr>
+            <w:tcW w:w="7639" w:type="dxa"/>
+          </w:tcPr>
+          <w:p>
+            <w:pPr>
+              <w:pStyle w:val="TableText"/>
+              <w:jc w:val="left"/>
+              <w:wordWrap w:val="0"/>
+              <w:keepNext/>
+              <w:spacing w:before="0" w:after="0" w:line="320" w:lineRule="exact"/>
+            </w:pPr>
+            <w:r>
+              <w:rPr>
+                <w:rFonts w:ascii="Calibri" w:hAnsi="Calibri" w:eastAsia="Microsoft YaHei" w:cs="Calibri"/>
+                <w:sz w:val="16"/>
+                <w:szCs w:val="16"/>
+              </w:rPr>
+              <w:t xml:space="preserve">Clear、ClearAck、UpgradeReq/Resp/AckNotify、InvalidateReq/Ack、RecallReq/Resp</w:t>
+            </w:r>
+          </w:p>
+        </w:tc>
+      </w:tr>
+      <w:tr>
+        <w:trPr>
+          <w:cantSplit/>
+        </w:trPr>
+        <w:tc>
+          <w:tcPr>
+            <w:tcW w:w="1960" w:type="dxa"/>
+          </w:tcPr>
+          <w:p>
+            <w:pPr>
+              <w:pStyle w:val="TableText"/>
+              <w:jc w:val="left"/>
+              <w:wordWrap w:val="0"/>
+              <w:keepNext/>
+              <w:spacing w:before="0" w:after="0" w:line="320" w:lineRule="exact"/>
+            </w:pPr>
+            <w:r>
+              <w:rPr>
+                <w:rFonts w:ascii="Calibri" w:hAnsi="Calibri" w:eastAsia="Microsoft YaHei" w:cs="Calibri"/>
+                <w:sz w:val="18"/>
+                <w:szCs w:val="18"/>
+              </w:rPr>
+              <w:t xml:space="preserve">故障结构</w:t>
+            </w:r>
+          </w:p>
+        </w:tc>
+        <w:tc>
+          <w:tcPr>
+            <w:tcW w:w="7639" w:type="dxa"/>
+          </w:tcPr>
+          <w:p>
+            <w:pPr>
+              <w:pStyle w:val="TableText"/>
+              <w:jc w:val="left"/>
+              <w:wordWrap w:val="0"/>
+              <w:keepNext/>
+              <w:spacing w:before="0" w:after="0" w:line="320" w:lineRule="exact"/>
+            </w:pPr>
+            <w:r>
+              <w:rPr>
+                <w:rFonts w:ascii="Calibri" w:hAnsi="Calibri" w:eastAsia="Microsoft YaHei" w:cs="Calibri"/>
+                <w:sz w:val="18"/>
+                <w:szCs w:val="18"/>
+              </w:rPr>
+              <w:t xml:space="preserve">单次、连续、成对、组合</w:t>
+            </w:r>
+          </w:p>
+        </w:tc>
+      </w:tr>
+      <w:tr>
+        <w:trPr>
+          <w:cantSplit/>
+        </w:trPr>
+        <w:tc>
+          <w:tcPr>
+            <w:tcW w:w="1960" w:type="dxa"/>
+          </w:tcPr>
+          <w:p>
+            <w:pPr>
+              <w:pStyle w:val="TableText"/>
+              <w:jc w:val="left"/>
+              <w:wordWrap w:val="0"/>
+              <w:keepNext/>
+              <w:spacing w:before="0" w:after="0" w:line="320" w:lineRule="exact"/>
+            </w:pPr>
+            <w:r>
+              <w:rPr>
+                <w:rFonts w:ascii="Calibri" w:hAnsi="Calibri" w:eastAsia="Microsoft YaHei" w:cs="Calibri"/>
+                <w:sz w:val="18"/>
+                <w:szCs w:val="18"/>
+              </w:rPr>
+              <w:t xml:space="preserve">并发规模</w:t>
+            </w:r>
+          </w:p>
+        </w:tc>
+        <w:tc>
+          <w:tcPr>
+            <w:tcW w:w="7639" w:type="dxa"/>
+          </w:tcPr>
+          <w:p>
+            <w:pPr>
+              <w:pStyle w:val="TableText"/>
+              <w:jc w:val="left"/>
+              <w:wordWrap w:val="0"/>
+              <w:keepNext/>
+              <w:spacing w:before="0" w:after="0" w:line="320" w:lineRule="exact"/>
+            </w:pPr>
+            <w:r>
+              <w:rPr>
+                <w:rFonts w:ascii="Calibri" w:hAnsi="Calibri" w:eastAsia="Microsoft YaHei" w:cs="Calibri"/>
+                <w:sz w:val="18"/>
+                <w:szCs w:val="18"/>
+              </w:rPr>
+              <w:t xml:space="preserve">单 PA、多 PA、burst、Near-outstanding</w:t>
+            </w:r>
+          </w:p>
+        </w:tc>
+      </w:tr>
+      <w:tr>
+        <w:trPr>
+          <w:cantSplit/>
+        </w:trPr>
+        <w:tc>
+          <w:tcPr>
+            <w:tcW w:w="1960" w:type="dxa"/>
+          </w:tcPr>
+          <w:p>
+            <w:pPr>
+              <w:pStyle w:val="TableText"/>
+              <w:jc w:val="left"/>
+              <w:wordWrap w:val="0"/>
+              <w:keepNext/>
+              <w:spacing w:before="0" w:after="0" w:line="320" w:lineRule="exact"/>
+            </w:pPr>
+            <w:r>
+              <w:rPr>
+                <w:rFonts w:ascii="Calibri" w:hAnsi="Calibri" w:eastAsia="Microsoft YaHei" w:cs="Calibri"/>
+                <w:sz w:val="18"/>
+                <w:szCs w:val="18"/>
+              </w:rPr>
+              <w:t xml:space="preserve">拓扑</w:t>
+            </w:r>
+          </w:p>
+        </w:tc>
+        <w:tc>
+          <w:tcPr>
+            <w:tcW w:w="7639" w:type="dxa"/>
+          </w:tcPr>
+          <w:p>
+            <w:pPr>
+              <w:pStyle w:val="TableText"/>
+              <w:jc w:val="left"/>
+              <w:wordWrap w:val="0"/>
+              <w:keepNext/>
+              <w:spacing w:before="0" w:after="0" w:line="320" w:lineRule="exact"/>
+            </w:pPr>
+            <w:r>
+              <w:rPr>
+                <w:rFonts w:ascii="Calibri" w:hAnsi="Calibri" w:eastAsia="Microsoft YaHei" w:cs="Calibri"/>
+                <w:sz w:val="18"/>
+                <w:szCs w:val="18"/>
+              </w:rPr>
+              <w:t xml:space="preserve">3N1S、3N2S、8N2S、16N1S</w:t>
+            </w:r>
+          </w:p>
+        </w:tc>
+      </w:tr>
+      <w:tr>
+        <w:trPr>
+          <w:cantSplit/>
+        </w:trPr>
+        <w:tc>
+          <w:tcPr>
+            <w:tcW w:w="1960" w:type="dxa"/>
+          </w:tcPr>
+          <w:p>
+            <w:pPr>
+              <w:pStyle w:val="TableText"/>
+              <w:jc w:val="left"/>
+              <w:wordWrap w:val="0"/>
+              <w:spacing w:before="0" w:after="0" w:line="320" w:lineRule="exact"/>
+            </w:pPr>
+            <w:r>
+              <w:rPr>
+                <w:rFonts w:ascii="Calibri" w:hAnsi="Calibri" w:eastAsia="Microsoft YaHei" w:cs="Calibri"/>
+                <w:sz w:val="18"/>
+                <w:szCs w:val="18"/>
+              </w:rPr>
+              <w:t xml:space="preserve">观察性质</w:t>
+            </w:r>
+          </w:p>
+        </w:tc>
+        <w:tc>
+          <w:tcPr>
+            <w:tcW w:w="7639" w:type="dxa"/>
+          </w:tcPr>
+          <w:p>
+            <w:pPr>
+              <w:pStyle w:val="TableText"/>
+              <w:jc w:val="left"/>
+              <w:wordWrap w:val="0"/>
+              <w:spacing w:before="0" w:after="0" w:line="320" w:lineRule="exact"/>
+            </w:pPr>
+            <w:r>
+              <w:rPr>
+                <w:rFonts w:ascii="Calibri" w:hAnsi="Calibri" w:eastAsia="Microsoft YaHei" w:cs="Calibri"/>
+                <w:sz w:val="18"/>
+                <w:szCs w:val="18"/>
+              </w:rPr>
+              <w:t xml:space="preserve">Safety、Liveness、数据与权限收敛、幂等</w:t>
+            </w:r>
+          </w:p>
+        </w:tc>
+      </w:tr>
+    </w:tbl>
     <w:p>
       <w:pPr>
         <w:pStyle w:val="Heading3"/>
@@ -5795,7 +6180,7 @@
         <w:rPr>
           <w:rFonts w:ascii="Calibri" w:hAnsi="Calibri" w:eastAsia="Microsoft YaHei" w:cs="Calibri"/>
         </w:rPr>
-        <w:t xml:space="preserve">Q2 验证首 2 次和首 3 次消息丢失后的恢复，覆盖 Clear、UpgradeReq、InvalidateAck 和 RecallResp。Q3 验证以下有依赖关系的组合：</w:t>
+        <w:t xml:space="preserve">G2 验证首 2 次和首 3 次消息丢失后的恢复，覆盖 Clear、UpgradeReq、InvalidateAck 和 RecallResp。G3 验证以下有依赖关系的成对故障：</w:t>
       </w:r>
     </w:p>
     <w:p>
@@ -5873,7 +6258,7 @@
         <w:rPr>
           <w:rFonts w:ascii="Calibri" w:hAnsi="Calibri" w:eastAsia="Microsoft YaHei" w:cs="Calibri"/>
         </w:rPr>
-        <w:t xml:space="preserve">Q4 覆盖 32 PA、partial Ack、多源 Ack 和 Near-outstanding（请求数接近控制器并发 outstanding 上限）的代表流量。Q5 在以下拓扑完成请求和 Ack 故障验证：</w:t>
+        <w:t xml:space="preserve">G4 覆盖 32 PA、partial Ack、多源 Ack 和 Near-outstanding（请求数接近控制器并发 outstanding 上限）的代表流量。G5 在以下拓扑完成请求和 Ack 故障验证：</w:t>
       </w:r>
     </w:p>
     <w:tbl>
@@ -6944,7 +7329,7 @@
         <w:rPr>
           <w:rFonts w:ascii="Calibri" w:hAnsi="Calibri" w:eastAsia="Microsoft YaHei" w:cs="Calibri"/>
         </w:rPr>
-        <w:t xml:space="preserve">16N1S 多拓扑测试验证覆盖 16 个协议节点、跨节点共享者集合和正式性能工作负载。Q5 进一步覆盖该配置下的请求丢失、Ack 丢失和 Ack 延迟。结果确认了 16 节点规模下的协议端点与事务收敛能力。</w:t>
+        <w:t xml:space="preserve">16N1S 多拓扑测试验证覆盖 16 个协议节点、跨节点共享者集合和正式性能工作负载。G5 进一步覆盖该配置下的请求丢失、Ack 丢失和 Ack 延迟。结果确认了 16 节点规模下的协议端点与事务收敛能力。</w:t>
       </w:r>
     </w:p>
     <w:p>
@@ -6956,7 +7341,7 @@
         <w:rPr>
           <w:rFonts w:ascii="Calibri" w:hAnsi="Calibri" w:eastAsia="SimHei" w:cs="Calibri"/>
         </w:rPr>
-        <w:t xml:space="preserve">8. 交付内容</w:t>
+        <w:t xml:space="preserve">8. 验证规模与范围对照</w:t>
       </w:r>
     </w:p>
     <w:p>
@@ -6967,73 +7352,1976 @@
         <w:rPr>
           <w:rFonts w:ascii="Calibri" w:hAnsi="Calibri" w:eastAsia="Microsoft YaHei" w:cs="Calibri"/>
         </w:rPr>
-        <w:t xml:space="preserve">本次交付覆盖：</w:t>
-      </w:r>
-    </w:p>
-    <w:p>
-      <w:pPr>
-        <w:ind w:left="360" w:firstLine="0"/>
-      </w:pPr>
-      <w:r>
-        <w:rPr>
-          <w:rFonts w:ascii="Calibri" w:hAnsi="Calibri" w:eastAsia="Microsoft YaHei" w:cs="Calibri"/>
-        </w:rPr>
-        <w:t xml:space="preserve">• UBCC 目录状态与关键活性机制；</w:t>
-      </w:r>
-    </w:p>
-    <w:p>
-      <w:pPr>
-        <w:ind w:left="360" w:firstLine="0"/>
-      </w:pPr>
-      <w:r>
-        <w:rPr>
-          <w:rFonts w:ascii="Calibri" w:hAnsi="Calibri" w:eastAsia="Microsoft YaHei" w:cs="Calibri"/>
-        </w:rPr>
-        <w:t xml:space="preserve">• EP-RNF、EP-SNF 和 UBAdapter 协同；</w:t>
-      </w:r>
-    </w:p>
-    <w:p>
-      <w:pPr>
-        <w:ind w:left="360" w:firstLine="0"/>
-      </w:pPr>
-      <w:r>
-        <w:rPr>
-          <w:rFonts w:ascii="Calibri" w:hAnsi="Calibri" w:eastAsia="Microsoft YaHei" w:cs="Calibri"/>
-        </w:rPr>
-        <w:t xml:space="preserve">• 可恢复消息传输故障；</w:t>
-      </w:r>
-    </w:p>
-    <w:p>
-      <w:pPr>
-        <w:ind w:left="360" w:firstLine="0"/>
-      </w:pPr>
-      <w:r>
-        <w:rPr>
-          <w:rFonts w:ascii="Calibri" w:hAnsi="Calibri" w:eastAsia="Microsoft YaHei" w:cs="Calibri"/>
-        </w:rPr>
-        <w:t xml:space="preserve">• 3N1S、3N2S、8N2S 和 16N1S 代表拓扑；</w:t>
-      </w:r>
-    </w:p>
-    <w:p>
-      <w:pPr>
-        <w:ind w:left="360" w:firstLine="0"/>
-      </w:pPr>
-      <w:r>
-        <w:rPr>
-          <w:rFonts w:ascii="Calibri" w:hAnsi="Calibri" w:eastAsia="Microsoft YaHei" w:cs="Calibri"/>
-        </w:rPr>
-        <w:t xml:space="preserve">• O3 处理器模型下的同步语义；</w:t>
-      </w:r>
-    </w:p>
-    <w:p>
-      <w:pPr>
-        <w:ind w:left="360" w:firstLine="0"/>
-      </w:pPr>
-      <w:r>
-        <w:rPr>
-          <w:rFonts w:ascii="Calibri" w:hAnsi="Calibri" w:eastAsia="Microsoft YaHei" w:cs="Calibri"/>
-        </w:rPr>
-        <w:t xml:space="preserve">• 性能矩阵执行前的正确性测试。</w:t>
+        <w:t xml:space="preserve">本节把 UBCC 分层验证的状态空间规模与覆盖范围，与公开的缓存一致性协议形式化验证、以及工业界的“形式化模型 + 定向故障注入”实践逐项对照；对照数据取自各工作的公开论文与官方页面（清单见附录 E 参考文献）。</w:t>
+      </w:r>
+    </w:p>
+    <w:p>
+      <w:pPr>
+        <w:pStyle w:val="Heading3"/>
+        <w:keepNext/>
+      </w:pPr>
+      <w:r>
+        <w:rPr>
+          <w:rFonts w:ascii="Calibri" w:hAnsi="Calibri" w:eastAsia="SimHei" w:cs="Calibri"/>
+        </w:rPr>
+        <w:t xml:space="preserve">8.1 形式化验证规模</w:t>
+      </w:r>
+    </w:p>
+    <w:p>
+      <w:pPr>
+        <w:ind w:left="0" w:firstLine="420"/>
+      </w:pPr>
+      <w:r>
+        <w:rPr>
+          <w:rFonts w:ascii="Calibri" w:hAnsi="Calibri" w:eastAsia="Microsoft YaHei" w:cs="Calibri"/>
+        </w:rPr>
+        <w:t xml:space="preserve">UBCC 的 TLA+ 分层模型在明确配置下完成全状态检查、零反例：</w:t>
+      </w:r>
+    </w:p>
+    <w:tbl>
+      <w:tblPr>
+        <w:tblStyle w:val="TableGrid"/>
+        <w:tblW w:w="5000" w:type="pct"/>
+        <w:tblLayout w:type="fixed"/>
+        <w:tblCellMar>
+          <w:top w:w="60" w:type="dxa"/>
+          <w:left w:w="90" w:type="dxa"/>
+          <w:bottom w:w="60" w:type="dxa"/>
+          <w:right w:w="90" w:type="dxa"/>
+        </w:tblCellMar>
+      </w:tblPr>
+      <w:tblGrid>
+        <w:gridCol w:w="3184"/>
+        <w:gridCol w:w="3063"/>
+        <w:gridCol w:w="1856"/>
+        <w:gridCol w:w="1494"/>
+      </w:tblGrid>
+      <w:tr>
+        <w:trPr>
+          <w:cantSplit/>
+          <w:tblHeader/>
+        </w:trPr>
+        <w:tc>
+          <w:tcPr>
+            <w:tcW w:w="3184" w:type="dxa"/>
+            <w:shd w:val="clear" w:color="auto" w:fill="D9E2F3"/>
+          </w:tcPr>
+          <w:p>
+            <w:pPr>
+              <w:pStyle w:val="TableText"/>
+              <w:jc w:val="left"/>
+              <w:wordWrap w:val="0"/>
+              <w:keepNext/>
+              <w:spacing w:before="0" w:after="0" w:line="320" w:lineRule="exact"/>
+            </w:pPr>
+            <w:r>
+              <w:rPr>
+                <w:rFonts w:ascii="Calibri" w:hAnsi="Calibri" w:eastAsia="SimHei" w:cs="Calibri"/>
+                <w:b/>
+                <w:sz w:val="18"/>
+                <w:szCs w:val="18"/>
+              </w:rPr>
+              <w:t xml:space="preserve">模型</w:t>
+            </w:r>
+          </w:p>
+        </w:tc>
+        <w:tc>
+          <w:tcPr>
+            <w:tcW w:w="3063" w:type="dxa"/>
+            <w:shd w:val="clear" w:color="auto" w:fill="D9E2F3"/>
+          </w:tcPr>
+          <w:p>
+            <w:pPr>
+              <w:pStyle w:val="TableText"/>
+              <w:jc w:val="left"/>
+              <w:wordWrap w:val="0"/>
+              <w:keepNext/>
+              <w:spacing w:before="0" w:after="0" w:line="320" w:lineRule="exact"/>
+            </w:pPr>
+            <w:r>
+              <w:rPr>
+                <w:rFonts w:ascii="Calibri" w:hAnsi="Calibri" w:eastAsia="SimHei" w:cs="Calibri"/>
+                <w:b/>
+                <w:sz w:val="18"/>
+                <w:szCs w:val="18"/>
+              </w:rPr>
+              <w:t xml:space="preserve">配置</w:t>
+            </w:r>
+          </w:p>
+        </w:tc>
+        <w:tc>
+          <w:tcPr>
+            <w:tcW w:w="1856" w:type="dxa"/>
+            <w:shd w:val="clear" w:color="auto" w:fill="D9E2F3"/>
+          </w:tcPr>
+          <w:p>
+            <w:pPr>
+              <w:pStyle w:val="TableText"/>
+              <w:jc w:val="left"/>
+              <w:wordWrap w:val="0"/>
+              <w:keepNext/>
+              <w:spacing w:before="0" w:after="0" w:line="320" w:lineRule="exact"/>
+            </w:pPr>
+            <w:r>
+              <w:rPr>
+                <w:rFonts w:ascii="Calibri" w:hAnsi="Calibri" w:eastAsia="SimHei" w:cs="Calibri"/>
+                <w:b/>
+                <w:sz w:val="18"/>
+                <w:szCs w:val="18"/>
+              </w:rPr>
+              <w:t xml:space="preserve">状态数</w:t>
+            </w:r>
+          </w:p>
+        </w:tc>
+        <w:tc>
+          <w:tcPr>
+            <w:tcW w:w="1494" w:type="dxa"/>
+            <w:shd w:val="clear" w:color="auto" w:fill="D9E2F3"/>
+          </w:tcPr>
+          <w:p>
+            <w:pPr>
+              <w:pStyle w:val="TableText"/>
+              <w:jc w:val="left"/>
+              <w:wordWrap w:val="0"/>
+              <w:keepNext/>
+              <w:spacing w:before="0" w:after="0" w:line="320" w:lineRule="exact"/>
+            </w:pPr>
+            <w:r>
+              <w:rPr>
+                <w:rFonts w:ascii="Calibri" w:hAnsi="Calibri" w:eastAsia="SimHei" w:cs="Calibri"/>
+                <w:b/>
+                <w:sz w:val="18"/>
+                <w:szCs w:val="18"/>
+              </w:rPr>
+              <w:t xml:space="preserve">性质</w:t>
+            </w:r>
+          </w:p>
+        </w:tc>
+      </w:tr>
+      <w:tr>
+        <w:trPr>
+          <w:cantSplit/>
+        </w:trPr>
+        <w:tc>
+          <w:tcPr>
+            <w:tcW w:w="3184" w:type="dxa"/>
+          </w:tcPr>
+          <w:p>
+            <w:pPr>
+              <w:pStyle w:val="TableText"/>
+              <w:jc w:val="left"/>
+              <w:wordWrap w:val="0"/>
+              <w:keepNext/>
+              <w:spacing w:before="0" w:after="0" w:line="320" w:lineRule="exact"/>
+            </w:pPr>
+            <w:r>
+              <w:rPr>
+                <w:rFonts w:ascii="Calibri" w:hAnsi="Calibri" w:eastAsia="Microsoft YaHei" w:cs="Calibri"/>
+                <w:sz w:val="18"/>
+                <w:szCs w:val="18"/>
+              </w:rPr>
+              <w:t xml:space="preserve">目录核心（安全性）</w:t>
+            </w:r>
+          </w:p>
+        </w:tc>
+        <w:tc>
+          <w:tcPr>
+            <w:tcW w:w="3063" w:type="dxa"/>
+          </w:tcPr>
+          <w:p>
+            <w:pPr>
+              <w:pStyle w:val="TableText"/>
+              <w:jc w:val="left"/>
+              <w:wordWrap w:val="0"/>
+              <w:keepNext/>
+              <w:spacing w:before="0" w:after="0" w:line="320" w:lineRule="exact"/>
+            </w:pPr>
+            <w:r>
+              <w:rPr>
+                <w:rFonts w:ascii="Calibri" w:hAnsi="Calibri" w:eastAsia="Microsoft YaHei" w:cs="Calibri"/>
+                <w:sz w:val="18"/>
+                <w:szCs w:val="18"/>
+              </w:rPr>
+              <w:t xml:space="preserve">3 节点、单地址、MaxEpoch=4</w:t>
+            </w:r>
+          </w:p>
+        </w:tc>
+        <w:tc>
+          <w:tcPr>
+            <w:tcW w:w="1856" w:type="dxa"/>
+          </w:tcPr>
+          <w:p>
+            <w:pPr>
+              <w:pStyle w:val="TableText"/>
+              <w:jc w:val="left"/>
+              <w:wordWrap w:val="0"/>
+              <w:keepNext/>
+              <w:spacing w:before="0" w:after="0" w:line="320" w:lineRule="exact"/>
+            </w:pPr>
+            <w:r>
+              <w:rPr>
+                <w:rFonts w:ascii="Calibri" w:hAnsi="Calibri" w:eastAsia="Microsoft YaHei" w:cs="Calibri"/>
+                <w:sz w:val="18"/>
+                <w:szCs w:val="18"/>
+              </w:rPr>
+              <w:t xml:space="preserve">20,980,755</w:t>
+            </w:r>
+          </w:p>
+        </w:tc>
+        <w:tc>
+          <w:tcPr>
+            <w:tcW w:w="1494" w:type="dxa"/>
+          </w:tcPr>
+          <w:p>
+            <w:pPr>
+              <w:pStyle w:val="TableText"/>
+              <w:jc w:val="left"/>
+              <w:wordWrap w:val="0"/>
+              <w:keepNext/>
+              <w:spacing w:before="0" w:after="0" w:line="320" w:lineRule="exact"/>
+            </w:pPr>
+            <w:r>
+              <w:rPr>
+                <w:rFonts w:ascii="Calibri" w:hAnsi="Calibri" w:eastAsia="Microsoft YaHei" w:cs="Calibri"/>
+                <w:sz w:val="18"/>
+                <w:szCs w:val="18"/>
+              </w:rPr>
+              <w:t xml:space="preserve">4 个不变量</w:t>
+            </w:r>
+          </w:p>
+        </w:tc>
+      </w:tr>
+      <w:tr>
+        <w:trPr>
+          <w:cantSplit/>
+        </w:trPr>
+        <w:tc>
+          <w:tcPr>
+            <w:tcW w:w="3184" w:type="dxa"/>
+          </w:tcPr>
+          <w:p>
+            <w:pPr>
+              <w:pStyle w:val="TableText"/>
+              <w:jc w:val="left"/>
+              <w:wordWrap w:val="0"/>
+              <w:keepNext/>
+              <w:spacing w:before="0" w:after="0" w:line="320" w:lineRule="exact"/>
+            </w:pPr>
+            <w:r>
+              <w:rPr>
+                <w:rFonts w:ascii="Calibri" w:hAnsi="Calibri" w:eastAsia="Microsoft YaHei" w:cs="Calibri"/>
+                <w:sz w:val="18"/>
+                <w:szCs w:val="18"/>
+              </w:rPr>
+              <w:t xml:space="preserve">目录核心（活性）</w:t>
+            </w:r>
+          </w:p>
+        </w:tc>
+        <w:tc>
+          <w:tcPr>
+            <w:tcW w:w="3063" w:type="dxa"/>
+          </w:tcPr>
+          <w:p>
+            <w:pPr>
+              <w:pStyle w:val="TableText"/>
+              <w:jc w:val="left"/>
+              <w:wordWrap w:val="0"/>
+              <w:keepNext/>
+              <w:spacing w:before="0" w:after="0" w:line="320" w:lineRule="exact"/>
+            </w:pPr>
+            <w:r>
+              <w:rPr>
+                <w:rFonts w:ascii="Calibri" w:hAnsi="Calibri" w:eastAsia="Microsoft YaHei" w:cs="Calibri"/>
+                <w:sz w:val="18"/>
+                <w:szCs w:val="18"/>
+              </w:rPr>
+              <w:t xml:space="preserve">同上（FairSpec）</w:t>
+            </w:r>
+          </w:p>
+        </w:tc>
+        <w:tc>
+          <w:tcPr>
+            <w:tcW w:w="1856" w:type="dxa"/>
+          </w:tcPr>
+          <w:p>
+            <w:pPr>
+              <w:pStyle w:val="TableText"/>
+              <w:jc w:val="left"/>
+              <w:wordWrap w:val="0"/>
+              <w:keepNext/>
+              <w:spacing w:before="0" w:after="0" w:line="320" w:lineRule="exact"/>
+            </w:pPr>
+            <w:r>
+              <w:rPr>
+                <w:rFonts w:ascii="Calibri" w:hAnsi="Calibri" w:eastAsia="Microsoft YaHei" w:cs="Calibri"/>
+                <w:sz w:val="18"/>
+                <w:szCs w:val="18"/>
+              </w:rPr>
+              <w:t xml:space="preserve">128,577</w:t>
+            </w:r>
+          </w:p>
+        </w:tc>
+        <w:tc>
+          <w:tcPr>
+            <w:tcW w:w="1494" w:type="dxa"/>
+          </w:tcPr>
+          <w:p>
+            <w:pPr>
+              <w:pStyle w:val="TableText"/>
+              <w:jc w:val="left"/>
+              <w:wordWrap w:val="0"/>
+              <w:keepNext/>
+              <w:spacing w:before="0" w:after="0" w:line="320" w:lineRule="exact"/>
+            </w:pPr>
+            <w:r>
+              <w:rPr>
+                <w:rFonts w:ascii="Calibri" w:hAnsi="Calibri" w:eastAsia="Microsoft YaHei" w:cs="Calibri"/>
+                <w:sz w:val="18"/>
+                <w:szCs w:val="18"/>
+              </w:rPr>
+              <w:t xml:space="preserve">4 个时序性质</w:t>
+            </w:r>
+          </w:p>
+        </w:tc>
+      </w:tr>
+      <w:tr>
+        <w:trPr>
+          <w:cantSplit/>
+        </w:trPr>
+        <w:tc>
+          <w:tcPr>
+            <w:tcW w:w="3184" w:type="dxa"/>
+          </w:tcPr>
+          <w:p>
+            <w:pPr>
+              <w:pStyle w:val="TableText"/>
+              <w:jc w:val="left"/>
+              <w:wordWrap w:val="0"/>
+              <w:keepNext/>
+              <w:spacing w:before="0" w:after="0" w:line="320" w:lineRule="exact"/>
+            </w:pPr>
+            <w:r>
+              <w:rPr>
+                <w:rFonts w:ascii="Calibri" w:hAnsi="Calibri" w:eastAsia="Microsoft YaHei" w:cs="Calibri"/>
+                <w:sz w:val="18"/>
+                <w:szCs w:val="18"/>
+              </w:rPr>
+              <w:t xml:space="preserve">传输故障</w:t>
+            </w:r>
+          </w:p>
+        </w:tc>
+        <w:tc>
+          <w:tcPr>
+            <w:tcW w:w="3063" w:type="dxa"/>
+          </w:tcPr>
+          <w:p>
+            <w:pPr>
+              <w:pStyle w:val="TableText"/>
+              <w:jc w:val="left"/>
+              <w:wordWrap w:val="0"/>
+              <w:keepNext/>
+              <w:spacing w:before="0" w:after="0" w:line="320" w:lineRule="exact"/>
+            </w:pPr>
+            <w:r>
+              <w:rPr>
+                <w:rFonts w:ascii="Calibri" w:hAnsi="Calibri" w:eastAsia="Microsoft YaHei" w:cs="Calibri"/>
+                <w:sz w:val="18"/>
+                <w:szCs w:val="18"/>
+              </w:rPr>
+              <w:t xml:space="preserve">3 节点、单地址、MaxEpoch=4</w:t>
+            </w:r>
+          </w:p>
+        </w:tc>
+        <w:tc>
+          <w:tcPr>
+            <w:tcW w:w="1856" w:type="dxa"/>
+          </w:tcPr>
+          <w:p>
+            <w:pPr>
+              <w:pStyle w:val="TableText"/>
+              <w:jc w:val="left"/>
+              <w:wordWrap w:val="0"/>
+              <w:keepNext/>
+              <w:spacing w:before="0" w:after="0" w:line="320" w:lineRule="exact"/>
+            </w:pPr>
+            <w:r>
+              <w:rPr>
+                <w:rFonts w:ascii="Calibri" w:hAnsi="Calibri" w:eastAsia="Microsoft YaHei" w:cs="Calibri"/>
+                <w:sz w:val="18"/>
+                <w:szCs w:val="18"/>
+              </w:rPr>
+              <w:t xml:space="preserve">23,242,903</w:t>
+            </w:r>
+          </w:p>
+        </w:tc>
+        <w:tc>
+          <w:tcPr>
+            <w:tcW w:w="1494" w:type="dxa"/>
+          </w:tcPr>
+          <w:p>
+            <w:pPr>
+              <w:pStyle w:val="TableText"/>
+              <w:jc w:val="left"/>
+              <w:wordWrap w:val="0"/>
+              <w:keepNext/>
+              <w:spacing w:before="0" w:after="0" w:line="320" w:lineRule="exact"/>
+            </w:pPr>
+            <w:r>
+              <w:rPr>
+                <w:rFonts w:ascii="Calibri" w:hAnsi="Calibri" w:eastAsia="Microsoft YaHei" w:cs="Calibri"/>
+                <w:sz w:val="18"/>
+                <w:szCs w:val="18"/>
+              </w:rPr>
+              <w:t xml:space="preserve">9 个不变量</w:t>
+            </w:r>
+          </w:p>
+        </w:tc>
+      </w:tr>
+      <w:tr>
+        <w:trPr>
+          <w:cantSplit/>
+        </w:trPr>
+        <w:tc>
+          <w:tcPr>
+            <w:tcW w:w="3184" w:type="dxa"/>
+          </w:tcPr>
+          <w:p>
+            <w:pPr>
+              <w:pStyle w:val="TableText"/>
+              <w:jc w:val="left"/>
+              <w:wordWrap w:val="0"/>
+              <w:keepNext/>
+              <w:spacing w:before="0" w:after="0" w:line="320" w:lineRule="exact"/>
+            </w:pPr>
+            <w:r>
+              <w:rPr>
+                <w:rFonts w:ascii="Calibri" w:hAnsi="Calibri" w:eastAsia="Microsoft YaHei" w:cs="Calibri"/>
+                <w:sz w:val="18"/>
+                <w:szCs w:val="18"/>
+              </w:rPr>
+              <w:t xml:space="preserve">EP 单 Socket</w:t>
+            </w:r>
+          </w:p>
+        </w:tc>
+        <w:tc>
+          <w:tcPr>
+            <w:tcW w:w="3063" w:type="dxa"/>
+          </w:tcPr>
+          <w:p>
+            <w:pPr>
+              <w:pStyle w:val="TableText"/>
+              <w:jc w:val="left"/>
+              <w:wordWrap w:val="0"/>
+              <w:keepNext/>
+              <w:spacing w:before="0" w:after="0" w:line="320" w:lineRule="exact"/>
+            </w:pPr>
+            <w:r>
+              <w:rPr>
+                <w:rFonts w:ascii="Calibri" w:hAnsi="Calibri" w:eastAsia="Microsoft YaHei" w:cs="Calibri"/>
+                <w:sz w:val="18"/>
+                <w:szCs w:val="18"/>
+              </w:rPr>
+              <w:t xml:space="preserve">2 CPU、单节点、单地址</w:t>
+            </w:r>
+          </w:p>
+        </w:tc>
+        <w:tc>
+          <w:tcPr>
+            <w:tcW w:w="1856" w:type="dxa"/>
+          </w:tcPr>
+          <w:p>
+            <w:pPr>
+              <w:pStyle w:val="TableText"/>
+              <w:jc w:val="left"/>
+              <w:wordWrap w:val="0"/>
+              <w:keepNext/>
+              <w:spacing w:before="0" w:after="0" w:line="320" w:lineRule="exact"/>
+            </w:pPr>
+            <w:r>
+              <w:rPr>
+                <w:rFonts w:ascii="Calibri" w:hAnsi="Calibri" w:eastAsia="Microsoft YaHei" w:cs="Calibri"/>
+                <w:sz w:val="18"/>
+                <w:szCs w:val="18"/>
+              </w:rPr>
+              <w:t xml:space="preserve">74M</w:t>
+            </w:r>
+          </w:p>
+        </w:tc>
+        <w:tc>
+          <w:tcPr>
+            <w:tcW w:w="1494" w:type="dxa"/>
+          </w:tcPr>
+          <w:p>
+            <w:pPr>
+              <w:pStyle w:val="TableText"/>
+              <w:jc w:val="left"/>
+              <w:wordWrap w:val="0"/>
+              <w:keepNext/>
+              <w:spacing w:before="0" w:after="0" w:line="320" w:lineRule="exact"/>
+            </w:pPr>
+            <w:r>
+              <w:rPr>
+                <w:rFonts w:ascii="Calibri" w:hAnsi="Calibri" w:eastAsia="Microsoft YaHei" w:cs="Calibri"/>
+                <w:sz w:val="18"/>
+                <w:szCs w:val="18"/>
+              </w:rPr>
+              <w:t xml:space="preserve">6 个不变量</w:t>
+            </w:r>
+          </w:p>
+        </w:tc>
+      </w:tr>
+      <w:tr>
+        <w:trPr>
+          <w:cantSplit/>
+        </w:trPr>
+        <w:tc>
+          <w:tcPr>
+            <w:tcW w:w="3184" w:type="dxa"/>
+          </w:tcPr>
+          <w:p>
+            <w:pPr>
+              <w:pStyle w:val="TableText"/>
+              <w:jc w:val="left"/>
+              <w:wordWrap w:val="0"/>
+              <w:keepNext/>
+              <w:spacing w:before="0" w:after="0" w:line="320" w:lineRule="exact"/>
+            </w:pPr>
+            <w:r>
+              <w:rPr>
+                <w:rFonts w:ascii="Calibri" w:hAnsi="Calibri" w:eastAsia="Microsoft YaHei" w:cs="Calibri"/>
+                <w:sz w:val="18"/>
+                <w:szCs w:val="18"/>
+              </w:rPr>
+              <w:t xml:space="preserve">EP 双 Socket</w:t>
+            </w:r>
+          </w:p>
+        </w:tc>
+        <w:tc>
+          <w:tcPr>
+            <w:tcW w:w="3063" w:type="dxa"/>
+          </w:tcPr>
+          <w:p>
+            <w:pPr>
+              <w:pStyle w:val="TableText"/>
+              <w:jc w:val="left"/>
+              <w:wordWrap w:val="0"/>
+              <w:keepNext/>
+              <w:spacing w:before="0" w:after="0" w:line="320" w:lineRule="exact"/>
+            </w:pPr>
+            <w:r>
+              <w:rPr>
+                <w:rFonts w:ascii="Calibri" w:hAnsi="Calibri" w:eastAsia="Microsoft YaHei" w:cs="Calibri"/>
+                <w:sz w:val="18"/>
+                <w:szCs w:val="18"/>
+              </w:rPr>
+              <w:t xml:space="preserve">2 CPU × 2 Socket、单地址</w:t>
+            </w:r>
+          </w:p>
+        </w:tc>
+        <w:tc>
+          <w:tcPr>
+            <w:tcW w:w="1856" w:type="dxa"/>
+          </w:tcPr>
+          <w:p>
+            <w:pPr>
+              <w:pStyle w:val="TableText"/>
+              <w:jc w:val="left"/>
+              <w:wordWrap w:val="0"/>
+              <w:keepNext/>
+              <w:spacing w:before="0" w:after="0" w:line="320" w:lineRule="exact"/>
+            </w:pPr>
+            <w:r>
+              <w:rPr>
+                <w:rFonts w:ascii="Calibri" w:hAnsi="Calibri" w:eastAsia="Microsoft YaHei" w:cs="Calibri"/>
+                <w:sz w:val="18"/>
+                <w:szCs w:val="18"/>
+              </w:rPr>
+              <w:t xml:space="preserve">52M</w:t>
+            </w:r>
+          </w:p>
+        </w:tc>
+        <w:tc>
+          <w:tcPr>
+            <w:tcW w:w="1494" w:type="dxa"/>
+          </w:tcPr>
+          <w:p>
+            <w:pPr>
+              <w:pStyle w:val="TableText"/>
+              <w:jc w:val="left"/>
+              <w:wordWrap w:val="0"/>
+              <w:keepNext/>
+              <w:spacing w:before="0" w:after="0" w:line="320" w:lineRule="exact"/>
+            </w:pPr>
+            <w:r>
+              <w:rPr>
+                <w:rFonts w:ascii="Calibri" w:hAnsi="Calibri" w:eastAsia="Microsoft YaHei" w:cs="Calibri"/>
+                <w:sz w:val="18"/>
+                <w:szCs w:val="18"/>
+              </w:rPr>
+              <w:t xml:space="preserve">8 个不变量</w:t>
+            </w:r>
+          </w:p>
+        </w:tc>
+      </w:tr>
+      <w:tr>
+        <w:trPr>
+          <w:cantSplit/>
+        </w:trPr>
+        <w:tc>
+          <w:tcPr>
+            <w:tcW w:w="3184" w:type="dxa"/>
+          </w:tcPr>
+          <w:p>
+            <w:pPr>
+              <w:pStyle w:val="TableText"/>
+              <w:jc w:val="left"/>
+              <w:wordWrap w:val="0"/>
+              <w:keepNext/>
+              <w:spacing w:before="0" w:after="0" w:line="320" w:lineRule="exact"/>
+            </w:pPr>
+            <w:r>
+              <w:rPr>
+                <w:rFonts w:ascii="Calibri" w:hAnsi="Calibri" w:eastAsia="Microsoft YaHei" w:cs="Calibri"/>
+                <w:sz w:val="18"/>
+                <w:szCs w:val="18"/>
+              </w:rPr>
+              <w:t xml:space="preserve">EP-RNF snoop 仲裁</w:t>
+            </w:r>
+          </w:p>
+        </w:tc>
+        <w:tc>
+          <w:tcPr>
+            <w:tcW w:w="3063" w:type="dxa"/>
+          </w:tcPr>
+          <w:p>
+            <w:pPr>
+              <w:pStyle w:val="TableText"/>
+              <w:jc w:val="left"/>
+              <w:wordWrap w:val="0"/>
+              <w:keepNext/>
+              <w:spacing w:before="0" w:after="0" w:line="320" w:lineRule="exact"/>
+            </w:pPr>
+            <w:r>
+              <w:rPr>
+                <w:rFonts w:ascii="Calibri" w:hAnsi="Calibri" w:eastAsia="Microsoft YaHei" w:cs="Calibri"/>
+                <w:sz w:val="18"/>
+                <w:szCs w:val="18"/>
+              </w:rPr>
+              <w:t xml:space="preserve">focused 模型</w:t>
+            </w:r>
+          </w:p>
+        </w:tc>
+        <w:tc>
+          <w:tcPr>
+            <w:tcW w:w="1856" w:type="dxa"/>
+          </w:tcPr>
+          <w:p>
+            <w:pPr>
+              <w:pStyle w:val="TableText"/>
+              <w:jc w:val="left"/>
+              <w:wordWrap w:val="0"/>
+              <w:keepNext/>
+              <w:spacing w:before="0" w:after="0" w:line="320" w:lineRule="exact"/>
+            </w:pPr>
+            <w:r>
+              <w:rPr>
+                <w:rFonts w:ascii="Calibri" w:hAnsi="Calibri" w:eastAsia="Microsoft YaHei" w:cs="Calibri"/>
+                <w:sz w:val="18"/>
+                <w:szCs w:val="18"/>
+              </w:rPr>
+              <w:t xml:space="preserve">328</w:t>
+            </w:r>
+          </w:p>
+        </w:tc>
+        <w:tc>
+          <w:tcPr>
+            <w:tcW w:w="1494" w:type="dxa"/>
+          </w:tcPr>
+          <w:p>
+            <w:pPr>
+              <w:pStyle w:val="TableText"/>
+              <w:jc w:val="left"/>
+              <w:wordWrap w:val="0"/>
+              <w:keepNext/>
+              <w:spacing w:before="0" w:after="0" w:line="320" w:lineRule="exact"/>
+            </w:pPr>
+            <w:r>
+              <w:rPr>
+                <w:rFonts w:ascii="Calibri" w:hAnsi="Calibri" w:eastAsia="Microsoft YaHei" w:cs="Calibri"/>
+                <w:sz w:val="18"/>
+                <w:szCs w:val="18"/>
+              </w:rPr>
+              <w:t xml:space="preserve">安全性矩阵</w:t>
+            </w:r>
+          </w:p>
+        </w:tc>
+      </w:tr>
+      <w:tr>
+        <w:trPr>
+          <w:cantSplit/>
+        </w:trPr>
+        <w:tc>
+          <w:tcPr>
+            <w:tcW w:w="3184" w:type="dxa"/>
+          </w:tcPr>
+          <w:p>
+            <w:pPr>
+              <w:pStyle w:val="TableText"/>
+              <w:jc w:val="left"/>
+              <w:wordWrap w:val="0"/>
+              <w:spacing w:before="0" w:after="0" w:line="320" w:lineRule="exact"/>
+            </w:pPr>
+            <w:r>
+              <w:rPr>
+                <w:rFonts w:ascii="Calibri" w:hAnsi="Calibri" w:eastAsia="Microsoft YaHei" w:cs="Calibri"/>
+                <w:sz w:val="18"/>
+                <w:szCs w:val="18"/>
+              </w:rPr>
+              <w:t xml:space="preserve">committed waiter 精确退役</w:t>
+            </w:r>
+          </w:p>
+        </w:tc>
+        <w:tc>
+          <w:tcPr>
+            <w:tcW w:w="3063" w:type="dxa"/>
+          </w:tcPr>
+          <w:p>
+            <w:pPr>
+              <w:pStyle w:val="TableText"/>
+              <w:jc w:val="left"/>
+              <w:wordWrap w:val="0"/>
+              <w:spacing w:before="0" w:after="0" w:line="320" w:lineRule="exact"/>
+            </w:pPr>
+            <w:r>
+              <w:rPr>
+                <w:rFonts w:ascii="Calibri" w:hAnsi="Calibri" w:eastAsia="Microsoft YaHei" w:cs="Calibri"/>
+                <w:sz w:val="18"/>
+                <w:szCs w:val="18"/>
+              </w:rPr>
+              <w:t xml:space="preserve">focused 模型</w:t>
+            </w:r>
+          </w:p>
+        </w:tc>
+        <w:tc>
+          <w:tcPr>
+            <w:tcW w:w="1856" w:type="dxa"/>
+          </w:tcPr>
+          <w:p>
+            <w:pPr>
+              <w:pStyle w:val="TableText"/>
+              <w:jc w:val="left"/>
+              <w:wordWrap w:val="0"/>
+              <w:spacing w:before="0" w:after="0" w:line="320" w:lineRule="exact"/>
+            </w:pPr>
+            <w:r>
+              <w:rPr>
+                <w:rFonts w:ascii="Calibri" w:hAnsi="Calibri" w:eastAsia="Microsoft YaHei" w:cs="Calibri"/>
+                <w:sz w:val="18"/>
+                <w:szCs w:val="18"/>
+              </w:rPr>
+              <w:t xml:space="preserve">274,593</w:t>
+            </w:r>
+          </w:p>
+        </w:tc>
+        <w:tc>
+          <w:tcPr>
+            <w:tcW w:w="1494" w:type="dxa"/>
+          </w:tcPr>
+          <w:p>
+            <w:pPr>
+              <w:pStyle w:val="TableText"/>
+              <w:jc w:val="left"/>
+              <w:wordWrap w:val="0"/>
+              <w:spacing w:before="0" w:after="0" w:line="320" w:lineRule="exact"/>
+            </w:pPr>
+            <w:r>
+              <w:rPr>
+                <w:rFonts w:ascii="Calibri" w:hAnsi="Calibri" w:eastAsia="Microsoft YaHei" w:cs="Calibri"/>
+                <w:sz w:val="18"/>
+                <w:szCs w:val="18"/>
+              </w:rPr>
+              <w:t xml:space="preserve">安全性</w:t>
+            </w:r>
+          </w:p>
+        </w:tc>
+      </w:tr>
+    </w:tbl>
+    <w:p>
+      <w:pPr>
+        <w:ind w:left="0" w:firstLine="420"/>
+      </w:pPr>
+      <w:r>
+        <w:rPr>
+          <w:rFonts w:ascii="Calibri" w:hAnsi="Calibri" w:eastAsia="Microsoft YaHei" w:cs="Calibri"/>
+        </w:rPr>
+        <w:t xml:space="preserve">目录核心模型达到 </w:t>
+      </w:r>
+      <w:r>
+        <w:rPr>
+          <w:rFonts w:ascii="Calibri" w:hAnsi="Calibri" w:eastAsia="Microsoft YaHei" w:cs="Calibri"/>
+          <w:b/>
+        </w:rPr>
+        <w:t xml:space="preserve">15/15 协议动作全覆盖</w:t>
+      </w:r>
+      <w:r>
+        <w:rPr>
+          <w:rFonts w:ascii="Calibri" w:hAnsi="Calibri" w:eastAsia="Microsoft YaHei" w:cs="Calibri"/>
+        </w:rPr>
+        <w:t xml:space="preserve">（TLC 原生 action-coverage 指标）：GrantShared、GrantExclusive、RecallBarrier、RecallResponse、RecallToGrant、RecallOrphanCleanup、InvalidationBarrier、UpgradeBarrier、BarrierAck、ClearCommit、UpgradeCommit、Writeback、Evict、TickOnly、Stutter 各状态迁移路径都被穷举搜索触发。</w:t>
+      </w:r>
+    </w:p>
+    <w:p>
+      <w:pPr>
+        <w:pStyle w:val="Heading3"/>
+        <w:keepNext/>
+      </w:pPr>
+      <w:r>
+        <w:rPr>
+          <w:rFonts w:ascii="Calibri" w:hAnsi="Calibri" w:eastAsia="SimHei" w:cs="Calibri"/>
+        </w:rPr>
+        <w:t xml:space="preserve">8.2 状态空间数量级对照</w:t>
+      </w:r>
+    </w:p>
+    <w:tbl>
+      <w:tblPr>
+        <w:tblStyle w:val="TableGrid"/>
+        <w:tblW w:w="5000" w:type="pct"/>
+        <w:tblLayout w:type="fixed"/>
+        <w:tblCellMar>
+          <w:top w:w="60" w:type="dxa"/>
+          <w:left w:w="90" w:type="dxa"/>
+          <w:bottom w:w="60" w:type="dxa"/>
+          <w:right w:w="90" w:type="dxa"/>
+        </w:tblCellMar>
+      </w:tblPr>
+      <w:tblGrid>
+        <w:gridCol w:w="3651"/>
+        <w:gridCol w:w="2199"/>
+        <w:gridCol w:w="3748"/>
+      </w:tblGrid>
+      <w:tr>
+        <w:trPr>
+          <w:cantSplit/>
+          <w:tblHeader/>
+        </w:trPr>
+        <w:tc>
+          <w:tcPr>
+            <w:tcW w:w="3651" w:type="dxa"/>
+            <w:shd w:val="clear" w:color="auto" w:fill="D9E2F3"/>
+          </w:tcPr>
+          <w:p>
+            <w:pPr>
+              <w:pStyle w:val="TableText"/>
+              <w:jc w:val="left"/>
+              <w:wordWrap w:val="0"/>
+              <w:keepNext/>
+              <w:spacing w:before="0" w:after="0" w:line="320" w:lineRule="exact"/>
+            </w:pPr>
+            <w:r>
+              <w:rPr>
+                <w:rFonts w:ascii="Calibri" w:hAnsi="Calibri" w:eastAsia="SimHei" w:cs="Calibri"/>
+                <w:b/>
+                <w:sz w:val="18"/>
+                <w:szCs w:val="18"/>
+              </w:rPr>
+              <w:t xml:space="preserve">工作</w:t>
+            </w:r>
+          </w:p>
+        </w:tc>
+        <w:tc>
+          <w:tcPr>
+            <w:tcW w:w="2199" w:type="dxa"/>
+            <w:shd w:val="clear" w:color="auto" w:fill="D9E2F3"/>
+          </w:tcPr>
+          <w:p>
+            <w:pPr>
+              <w:pStyle w:val="TableText"/>
+              <w:jc w:val="left"/>
+              <w:wordWrap w:val="0"/>
+              <w:keepNext/>
+              <w:spacing w:before="0" w:after="0" w:line="320" w:lineRule="exact"/>
+            </w:pPr>
+            <w:r>
+              <w:rPr>
+                <w:rFonts w:ascii="Calibri" w:hAnsi="Calibri" w:eastAsia="SimHei" w:cs="Calibri"/>
+                <w:b/>
+                <w:sz w:val="18"/>
+                <w:szCs w:val="18"/>
+              </w:rPr>
+              <w:t xml:space="preserve">状态空间</w:t>
+            </w:r>
+          </w:p>
+        </w:tc>
+        <w:tc>
+          <w:tcPr>
+            <w:tcW w:w="3748" w:type="dxa"/>
+            <w:shd w:val="clear" w:color="auto" w:fill="D9E2F3"/>
+          </w:tcPr>
+          <w:p>
+            <w:pPr>
+              <w:pStyle w:val="TableText"/>
+              <w:jc w:val="left"/>
+              <w:wordWrap w:val="0"/>
+              <w:keepNext/>
+              <w:spacing w:before="0" w:after="0" w:line="320" w:lineRule="exact"/>
+            </w:pPr>
+            <w:r>
+              <w:rPr>
+                <w:rFonts w:ascii="Calibri" w:hAnsi="Calibri" w:eastAsia="SimHei" w:cs="Calibri"/>
+                <w:b/>
+                <w:sz w:val="18"/>
+                <w:szCs w:val="18"/>
+              </w:rPr>
+              <w:t xml:space="preserve">对照</w:t>
+            </w:r>
+          </w:p>
+        </w:tc>
+      </w:tr>
+      <w:tr>
+        <w:trPr>
+          <w:cantSplit/>
+        </w:trPr>
+        <w:tc>
+          <w:tcPr>
+            <w:tcW w:w="3651" w:type="dxa"/>
+          </w:tcPr>
+          <w:p>
+            <w:pPr>
+              <w:pStyle w:val="TableText"/>
+              <w:jc w:val="left"/>
+              <w:wordWrap w:val="0"/>
+              <w:spacing w:before="0" w:after="0" w:line="320" w:lineRule="exact"/>
+            </w:pPr>
+            <w:r>
+              <w:rPr>
+                <w:rFonts w:ascii="Calibri" w:hAnsi="Calibri" w:eastAsia="Microsoft YaHei" w:cs="Calibri"/>
+                <w:sz w:val="18"/>
+                <w:szCs w:val="18"/>
+              </w:rPr>
+              <w:t xml:space="preserve">Alpha EV6/EV7 缓存一致性 TLA+ 验证 [8]</w:t>
+            </w:r>
+          </w:p>
+        </w:tc>
+        <w:tc>
+          <w:tcPr>
+            <w:tcW w:w="2199" w:type="dxa"/>
+          </w:tcPr>
+          <w:p>
+            <w:pPr>
+              <w:pStyle w:val="TableText"/>
+              <w:jc w:val="left"/>
+              <w:wordWrap w:val="0"/>
+              <w:spacing w:before="0" w:after="0" w:line="320" w:lineRule="exact"/>
+            </w:pPr>
+            <w:r>
+              <w:rPr>
+                <w:rFonts w:ascii="Calibri" w:hAnsi="Calibri" w:eastAsia="Microsoft YaHei" w:cs="Calibri"/>
+                <w:sz w:val="18"/>
+                <w:szCs w:val="18"/>
+              </w:rPr>
+              <w:t xml:space="preserve">600 万–1200 万可达状态</w:t>
+            </w:r>
+          </w:p>
+        </w:tc>
+        <w:tc>
+          <w:tcPr>
+            <w:tcW w:w="3748" w:type="dxa"/>
+          </w:tcPr>
+          <w:p>
+            <w:pPr>
+              <w:pStyle w:val="TableText"/>
+              <w:jc w:val="left"/>
+              <w:wordWrap w:val="0"/>
+              <w:spacing w:before="0" w:after="0" w:line="320" w:lineRule="exact"/>
+            </w:pPr>
+            <w:r>
+              <w:rPr>
+                <w:rFonts w:ascii="Calibri" w:hAnsi="Calibri" w:eastAsia="Microsoft YaHei" w:cs="Calibri"/>
+                <w:sz w:val="18"/>
+                <w:szCs w:val="18"/>
+              </w:rPr>
+              <w:t xml:space="preserve">UBCC 目录核心 2098 万、传输故障 2324 万，同一数量级且更大</w:t>
+            </w:r>
+          </w:p>
+        </w:tc>
+      </w:tr>
+    </w:tbl>
+    <w:p>
+      <w:pPr>
+        <w:pStyle w:val="Heading3"/>
+        <w:keepNext/>
+      </w:pPr>
+      <w:r>
+        <w:rPr>
+          <w:rFonts w:ascii="Calibri" w:hAnsi="Calibri" w:eastAsia="SimHei" w:cs="Calibri"/>
+        </w:rPr>
+        <w:t xml:space="preserve">8.3 形式化配置（并发主体与地址）对照</w:t>
+      </w:r>
+    </w:p>
+    <w:tbl>
+      <w:tblPr>
+        <w:tblStyle w:val="TableGrid"/>
+        <w:tblW w:w="5000" w:type="pct"/>
+        <w:tblLayout w:type="fixed"/>
+        <w:tblCellMar>
+          <w:top w:w="60" w:type="dxa"/>
+          <w:left w:w="90" w:type="dxa"/>
+          <w:bottom w:w="60" w:type="dxa"/>
+          <w:right w:w="90" w:type="dxa"/>
+        </w:tblCellMar>
+      </w:tblPr>
+      <w:tblGrid>
+        <w:gridCol w:w="3032"/>
+        <w:gridCol w:w="2139"/>
+        <w:gridCol w:w="2809"/>
+        <w:gridCol w:w="1618"/>
+      </w:tblGrid>
+      <w:tr>
+        <w:trPr>
+          <w:cantSplit/>
+          <w:tblHeader/>
+        </w:trPr>
+        <w:tc>
+          <w:tcPr>
+            <w:tcW w:w="3032" w:type="dxa"/>
+            <w:shd w:val="clear" w:color="auto" w:fill="D9E2F3"/>
+          </w:tcPr>
+          <w:p>
+            <w:pPr>
+              <w:pStyle w:val="TableText"/>
+              <w:jc w:val="left"/>
+              <w:wordWrap w:val="0"/>
+              <w:keepNext/>
+              <w:spacing w:before="0" w:after="0" w:line="320" w:lineRule="exact"/>
+            </w:pPr>
+            <w:r>
+              <w:rPr>
+                <w:rFonts w:ascii="Calibri" w:hAnsi="Calibri" w:eastAsia="SimHei" w:cs="Calibri"/>
+                <w:b/>
+                <w:sz w:val="18"/>
+                <w:szCs w:val="18"/>
+              </w:rPr>
+              <w:t xml:space="preserve">工作</w:t>
+            </w:r>
+          </w:p>
+        </w:tc>
+        <w:tc>
+          <w:tcPr>
+            <w:tcW w:w="2139" w:type="dxa"/>
+            <w:shd w:val="clear" w:color="auto" w:fill="D9E2F3"/>
+          </w:tcPr>
+          <w:p>
+            <w:pPr>
+              <w:pStyle w:val="TableText"/>
+              <w:jc w:val="left"/>
+              <w:wordWrap w:val="0"/>
+              <w:keepNext/>
+              <w:spacing w:before="0" w:after="0" w:line="320" w:lineRule="exact"/>
+            </w:pPr>
+            <w:r>
+              <w:rPr>
+                <w:rFonts w:ascii="Calibri" w:hAnsi="Calibri" w:eastAsia="SimHei" w:cs="Calibri"/>
+                <w:b/>
+                <w:sz w:val="18"/>
+                <w:szCs w:val="18"/>
+              </w:rPr>
+              <w:t xml:space="preserve">方法</w:t>
+            </w:r>
+          </w:p>
+        </w:tc>
+        <w:tc>
+          <w:tcPr>
+            <w:tcW w:w="2809" w:type="dxa"/>
+            <w:shd w:val="clear" w:color="auto" w:fill="D9E2F3"/>
+          </w:tcPr>
+          <w:p>
+            <w:pPr>
+              <w:pStyle w:val="TableText"/>
+              <w:jc w:val="left"/>
+              <w:wordWrap w:val="0"/>
+              <w:keepNext/>
+              <w:spacing w:before="0" w:after="0" w:line="320" w:lineRule="exact"/>
+            </w:pPr>
+            <w:r>
+              <w:rPr>
+                <w:rFonts w:ascii="Calibri" w:hAnsi="Calibri" w:eastAsia="SimHei" w:cs="Calibri"/>
+                <w:b/>
+                <w:sz w:val="18"/>
+                <w:szCs w:val="18"/>
+              </w:rPr>
+              <w:t xml:space="preserve">并发主体</w:t>
+            </w:r>
+          </w:p>
+        </w:tc>
+        <w:tc>
+          <w:tcPr>
+            <w:tcW w:w="1618" w:type="dxa"/>
+            <w:shd w:val="clear" w:color="auto" w:fill="D9E2F3"/>
+          </w:tcPr>
+          <w:p>
+            <w:pPr>
+              <w:pStyle w:val="TableText"/>
+              <w:jc w:val="left"/>
+              <w:wordWrap w:val="0"/>
+              <w:keepNext/>
+              <w:spacing w:before="0" w:after="0" w:line="320" w:lineRule="exact"/>
+            </w:pPr>
+            <w:r>
+              <w:rPr>
+                <w:rFonts w:ascii="Calibri" w:hAnsi="Calibri" w:eastAsia="SimHei" w:cs="Calibri"/>
+                <w:b/>
+                <w:sz w:val="18"/>
+                <w:szCs w:val="18"/>
+              </w:rPr>
+              <w:t xml:space="preserve">地址</w:t>
+            </w:r>
+          </w:p>
+        </w:tc>
+      </w:tr>
+      <w:tr>
+        <w:trPr>
+          <w:cantSplit/>
+        </w:trPr>
+        <w:tc>
+          <w:tcPr>
+            <w:tcW w:w="3032" w:type="dxa"/>
+          </w:tcPr>
+          <w:p>
+            <w:pPr>
+              <w:pStyle w:val="TableText"/>
+              <w:jc w:val="left"/>
+              <w:wordWrap w:val="0"/>
+              <w:keepNext/>
+              <w:spacing w:before="0" w:after="0" w:line="320" w:lineRule="exact"/>
+            </w:pPr>
+            <w:r>
+              <w:rPr>
+                <w:rFonts w:ascii="Calibri" w:hAnsi="Calibri" w:eastAsia="Microsoft YaHei" w:cs="Calibri"/>
+                <w:sz w:val="18"/>
+                <w:szCs w:val="18"/>
+              </w:rPr>
+              <w:t xml:space="preserve">Formalising CXL Cache Coherence（ASPLOS 2025）[3]</w:t>
+            </w:r>
+          </w:p>
+        </w:tc>
+        <w:tc>
+          <w:tcPr>
+            <w:tcW w:w="2139" w:type="dxa"/>
+          </w:tcPr>
+          <w:p>
+            <w:pPr>
+              <w:pStyle w:val="TableText"/>
+              <w:jc w:val="left"/>
+              <w:wordWrap w:val="0"/>
+              <w:keepNext/>
+              <w:spacing w:before="0" w:after="0" w:line="320" w:lineRule="exact"/>
+            </w:pPr>
+            <w:r>
+              <w:rPr>
+                <w:rFonts w:ascii="Calibri" w:hAnsi="Calibri" w:eastAsia="Microsoft YaHei" w:cs="Calibri"/>
+                <w:sz w:val="18"/>
+                <w:szCs w:val="18"/>
+              </w:rPr>
+              <w:t xml:space="preserve">Isabelle 定理证明</w:t>
+            </w:r>
+          </w:p>
+        </w:tc>
+        <w:tc>
+          <w:tcPr>
+            <w:tcW w:w="2809" w:type="dxa"/>
+          </w:tcPr>
+          <w:p>
+            <w:pPr>
+              <w:pStyle w:val="TableText"/>
+              <w:jc w:val="left"/>
+              <w:wordWrap w:val="0"/>
+              <w:keepNext/>
+              <w:spacing w:before="0" w:after="0" w:line="320" w:lineRule="exact"/>
+            </w:pPr>
+            <w:r>
+              <w:rPr>
+                <w:rFonts w:ascii="Calibri" w:hAnsi="Calibri" w:eastAsia="Microsoft YaHei" w:cs="Calibri"/>
+                <w:sz w:val="18"/>
+                <w:szCs w:val="18"/>
+              </w:rPr>
+              <w:t xml:space="preserve">2 设备 + Host</w:t>
+            </w:r>
+          </w:p>
+        </w:tc>
+        <w:tc>
+          <w:tcPr>
+            <w:tcW w:w="1618" w:type="dxa"/>
+          </w:tcPr>
+          <w:p>
+            <w:pPr>
+              <w:pStyle w:val="TableText"/>
+              <w:jc w:val="left"/>
+              <w:wordWrap w:val="0"/>
+              <w:keepNext/>
+              <w:spacing w:before="0" w:after="0" w:line="320" w:lineRule="exact"/>
+            </w:pPr>
+            <w:r>
+              <w:rPr>
+                <w:rFonts w:ascii="Calibri" w:hAnsi="Calibri" w:eastAsia="Microsoft YaHei" w:cs="Calibri"/>
+                <w:sz w:val="18"/>
+                <w:szCs w:val="18"/>
+              </w:rPr>
+              <w:t xml:space="preserve">1</w:t>
+            </w:r>
+          </w:p>
+        </w:tc>
+      </w:tr>
+      <w:tr>
+        <w:trPr>
+          <w:cantSplit/>
+        </w:trPr>
+        <w:tc>
+          <w:tcPr>
+            <w:tcW w:w="3032" w:type="dxa"/>
+          </w:tcPr>
+          <w:p>
+            <w:pPr>
+              <w:pStyle w:val="TableText"/>
+              <w:jc w:val="left"/>
+              <w:wordWrap w:val="0"/>
+              <w:keepNext/>
+              <w:spacing w:before="0" w:after="0" w:line="320" w:lineRule="exact"/>
+            </w:pPr>
+            <w:r>
+              <w:rPr>
+                <w:rFonts w:ascii="Calibri" w:hAnsi="Calibri" w:eastAsia="Microsoft YaHei" w:cs="Calibri"/>
+                <w:sz w:val="18"/>
+                <w:szCs w:val="18"/>
+              </w:rPr>
+              <w:t xml:space="preserve">HieraGen（ISCA 2020）[9]</w:t>
+            </w:r>
+          </w:p>
+        </w:tc>
+        <w:tc>
+          <w:tcPr>
+            <w:tcW w:w="2139" w:type="dxa"/>
+          </w:tcPr>
+          <w:p>
+            <w:pPr>
+              <w:pStyle w:val="TableText"/>
+              <w:jc w:val="left"/>
+              <w:wordWrap w:val="0"/>
+              <w:keepNext/>
+              <w:spacing w:before="0" w:after="0" w:line="320" w:lineRule="exact"/>
+            </w:pPr>
+            <w:r>
+              <w:rPr>
+                <w:rFonts w:ascii="Calibri" w:hAnsi="Calibri" w:eastAsia="Microsoft YaHei" w:cs="Calibri"/>
+                <w:sz w:val="18"/>
+                <w:szCs w:val="18"/>
+              </w:rPr>
+              <w:t xml:space="preserve">Murphi</w:t>
+            </w:r>
+          </w:p>
+        </w:tc>
+        <w:tc>
+          <w:tcPr>
+            <w:tcW w:w="2809" w:type="dxa"/>
+          </w:tcPr>
+          <w:p>
+            <w:pPr>
+              <w:pStyle w:val="TableText"/>
+              <w:jc w:val="left"/>
+              <w:wordWrap w:val="0"/>
+              <w:keepNext/>
+              <w:spacing w:before="0" w:after="0" w:line="320" w:lineRule="exact"/>
+            </w:pPr>
+            <w:r>
+              <w:rPr>
+                <w:rFonts w:ascii="Calibri" w:hAnsi="Calibri" w:eastAsia="Microsoft YaHei" w:cs="Calibri"/>
+                <w:sz w:val="18"/>
+                <w:szCs w:val="18"/>
+              </w:rPr>
+              <w:t xml:space="preserve">2–3 cache-L + 2 cache-H + 目录</w:t>
+            </w:r>
+          </w:p>
+        </w:tc>
+        <w:tc>
+          <w:tcPr>
+            <w:tcW w:w="1618" w:type="dxa"/>
+          </w:tcPr>
+          <w:p>
+            <w:pPr>
+              <w:pStyle w:val="TableText"/>
+              <w:jc w:val="left"/>
+              <w:wordWrap w:val="0"/>
+              <w:keepNext/>
+              <w:spacing w:before="0" w:after="0" w:line="320" w:lineRule="exact"/>
+            </w:pPr>
+            <w:r>
+              <w:rPr>
+                <w:rFonts w:ascii="Calibri" w:hAnsi="Calibri" w:eastAsia="Microsoft YaHei" w:cs="Calibri"/>
+                <w:sz w:val="18"/>
+                <w:szCs w:val="18"/>
+              </w:rPr>
+              <w:t xml:space="preserve">—</w:t>
+            </w:r>
+          </w:p>
+        </w:tc>
+      </w:tr>
+      <w:tr>
+        <w:trPr>
+          <w:cantSplit/>
+        </w:trPr>
+        <w:tc>
+          <w:tcPr>
+            <w:tcW w:w="3032" w:type="dxa"/>
+          </w:tcPr>
+          <w:p>
+            <w:pPr>
+              <w:pStyle w:val="TableText"/>
+              <w:jc w:val="left"/>
+              <w:wordWrap w:val="0"/>
+              <w:keepNext/>
+              <w:spacing w:before="0" w:after="0" w:line="320" w:lineRule="exact"/>
+            </w:pPr>
+            <w:r>
+              <w:rPr>
+                <w:rFonts w:ascii="Calibri" w:hAnsi="Calibri" w:eastAsia="Microsoft YaHei" w:cs="Calibri"/>
+                <w:sz w:val="18"/>
+                <w:szCs w:val="18"/>
+              </w:rPr>
+              <w:t xml:space="preserve">vCXLGen（ASPLOS 2026）[2]</w:t>
+            </w:r>
+          </w:p>
+        </w:tc>
+        <w:tc>
+          <w:tcPr>
+            <w:tcW w:w="2139" w:type="dxa"/>
+          </w:tcPr>
+          <w:p>
+            <w:pPr>
+              <w:pStyle w:val="TableText"/>
+              <w:jc w:val="left"/>
+              <w:wordWrap w:val="0"/>
+              <w:keepNext/>
+              <w:spacing w:before="0" w:after="0" w:line="320" w:lineRule="exact"/>
+            </w:pPr>
+            <w:r>
+              <w:rPr>
+                <w:rFonts w:ascii="Calibri" w:hAnsi="Calibri" w:eastAsia="Microsoft YaHei" w:cs="Calibri"/>
+                <w:sz w:val="18"/>
+                <w:szCs w:val="18"/>
+              </w:rPr>
+              <w:t xml:space="preserve">Murphi/Rumur 组合式模型检查</w:t>
+            </w:r>
+          </w:p>
+        </w:tc>
+        <w:tc>
+          <w:tcPr>
+            <w:tcW w:w="2809" w:type="dxa"/>
+          </w:tcPr>
+          <w:p>
+            <w:pPr>
+              <w:pStyle w:val="TableText"/>
+              <w:jc w:val="left"/>
+              <w:wordWrap w:val="0"/>
+              <w:keepNext/>
+              <w:spacing w:before="0" w:after="0" w:line="320" w:lineRule="exact"/>
+            </w:pPr>
+            <w:r>
+              <w:rPr>
+                <w:rFonts w:ascii="Calibri" w:hAnsi="Calibri" w:eastAsia="Microsoft YaHei" w:cs="Calibri"/>
+                <w:sz w:val="18"/>
+                <w:szCs w:val="18"/>
+              </w:rPr>
+              <w:t xml:space="preserve">4–6 cache controller</w:t>
+            </w:r>
+          </w:p>
+        </w:tc>
+        <w:tc>
+          <w:tcPr>
+            <w:tcW w:w="1618" w:type="dxa"/>
+          </w:tcPr>
+          <w:p>
+            <w:pPr>
+              <w:pStyle w:val="TableText"/>
+              <w:jc w:val="left"/>
+              <w:wordWrap w:val="0"/>
+              <w:keepNext/>
+              <w:spacing w:before="0" w:after="0" w:line="320" w:lineRule="exact"/>
+            </w:pPr>
+            <w:r>
+              <w:rPr>
+                <w:rFonts w:ascii="Calibri" w:hAnsi="Calibri" w:eastAsia="Microsoft YaHei" w:cs="Calibri"/>
+                <w:sz w:val="18"/>
+                <w:szCs w:val="18"/>
+              </w:rPr>
+              <w:t xml:space="preserve">随 litmus</w:t>
+            </w:r>
+          </w:p>
+        </w:tc>
+      </w:tr>
+      <w:tr>
+        <w:trPr>
+          <w:cantSplit/>
+        </w:trPr>
+        <w:tc>
+          <w:tcPr>
+            <w:tcW w:w="3032" w:type="dxa"/>
+          </w:tcPr>
+          <w:p>
+            <w:pPr>
+              <w:pStyle w:val="TableText"/>
+              <w:jc w:val="left"/>
+              <w:wordWrap w:val="0"/>
+              <w:keepNext/>
+              <w:spacing w:before="0" w:after="0" w:line="320" w:lineRule="exact"/>
+            </w:pPr>
+            <w:r>
+              <w:rPr>
+                <w:rFonts w:ascii="Calibri" w:hAnsi="Calibri" w:eastAsia="Microsoft YaHei" w:cs="Calibri"/>
+                <w:sz w:val="18"/>
+                <w:szCs w:val="18"/>
+              </w:rPr>
+              <w:t xml:space="preserve">Alpha EV6/EV7 [8]</w:t>
+            </w:r>
+          </w:p>
+        </w:tc>
+        <w:tc>
+          <w:tcPr>
+            <w:tcW w:w="2139" w:type="dxa"/>
+          </w:tcPr>
+          <w:p>
+            <w:pPr>
+              <w:pStyle w:val="TableText"/>
+              <w:jc w:val="left"/>
+              <w:wordWrap w:val="0"/>
+              <w:keepNext/>
+              <w:spacing w:before="0" w:after="0" w:line="320" w:lineRule="exact"/>
+            </w:pPr>
+            <w:r>
+              <w:rPr>
+                <w:rFonts w:ascii="Calibri" w:hAnsi="Calibri" w:eastAsia="Microsoft YaHei" w:cs="Calibri"/>
+                <w:sz w:val="18"/>
+                <w:szCs w:val="18"/>
+              </w:rPr>
+              <w:t xml:space="preserve">TLA+/TLC</w:t>
+            </w:r>
+          </w:p>
+        </w:tc>
+        <w:tc>
+          <w:tcPr>
+            <w:tcW w:w="2809" w:type="dxa"/>
+          </w:tcPr>
+          <w:p>
+            <w:pPr>
+              <w:pStyle w:val="TableText"/>
+              <w:jc w:val="left"/>
+              <w:wordWrap w:val="0"/>
+              <w:keepNext/>
+              <w:spacing w:before="0" w:after="0" w:line="320" w:lineRule="exact"/>
+            </w:pPr>
+            <w:r>
+              <w:rPr>
+                <w:rFonts w:ascii="Calibri" w:hAnsi="Calibri" w:eastAsia="Microsoft YaHei" w:cs="Calibri"/>
+                <w:sz w:val="18"/>
+                <w:szCs w:val="18"/>
+              </w:rPr>
+              <w:t xml:space="preserve">3 处理器</w:t>
+            </w:r>
+          </w:p>
+        </w:tc>
+        <w:tc>
+          <w:tcPr>
+            <w:tcW w:w="1618" w:type="dxa"/>
+          </w:tcPr>
+          <w:p>
+            <w:pPr>
+              <w:pStyle w:val="TableText"/>
+              <w:jc w:val="left"/>
+              <w:wordWrap w:val="0"/>
+              <w:keepNext/>
+              <w:spacing w:before="0" w:after="0" w:line="320" w:lineRule="exact"/>
+            </w:pPr>
+            <w:r>
+              <w:rPr>
+                <w:rFonts w:ascii="Calibri" w:hAnsi="Calibri" w:eastAsia="Microsoft YaHei" w:cs="Calibri"/>
+                <w:sz w:val="18"/>
+                <w:szCs w:val="18"/>
+              </w:rPr>
+              <w:t xml:space="preserve">1 cache line</w:t>
+            </w:r>
+          </w:p>
+        </w:tc>
+      </w:tr>
+      <w:tr>
+        <w:trPr>
+          <w:cantSplit/>
+        </w:trPr>
+        <w:tc>
+          <w:tcPr>
+            <w:tcW w:w="3032" w:type="dxa"/>
+          </w:tcPr>
+          <w:p>
+            <w:pPr>
+              <w:pStyle w:val="TableText"/>
+              <w:jc w:val="left"/>
+              <w:wordWrap w:val="0"/>
+              <w:spacing w:before="0" w:after="0" w:line="320" w:lineRule="exact"/>
+            </w:pPr>
+            <w:r>
+              <w:rPr>
+                <w:rFonts w:ascii="Calibri" w:hAnsi="Calibri" w:eastAsia="Microsoft YaHei" w:cs="Calibri"/>
+                <w:b/>
+                <w:sz w:val="18"/>
+                <w:szCs w:val="18"/>
+              </w:rPr>
+              <w:t xml:space="preserve">UBCC</w:t>
+            </w:r>
+          </w:p>
+        </w:tc>
+        <w:tc>
+          <w:tcPr>
+            <w:tcW w:w="2139" w:type="dxa"/>
+          </w:tcPr>
+          <w:p>
+            <w:pPr>
+              <w:pStyle w:val="TableText"/>
+              <w:jc w:val="left"/>
+              <w:wordWrap w:val="0"/>
+              <w:spacing w:before="0" w:after="0" w:line="320" w:lineRule="exact"/>
+            </w:pPr>
+            <w:r>
+              <w:rPr>
+                <w:rFonts w:ascii="Calibri" w:hAnsi="Calibri" w:eastAsia="Microsoft YaHei" w:cs="Calibri"/>
+                <w:b/>
+                <w:sz w:val="18"/>
+                <w:szCs w:val="18"/>
+              </w:rPr>
+              <w:t xml:space="preserve">TLA+ 分层</w:t>
+            </w:r>
+          </w:p>
+        </w:tc>
+        <w:tc>
+          <w:tcPr>
+            <w:tcW w:w="2809" w:type="dxa"/>
+          </w:tcPr>
+          <w:p>
+            <w:pPr>
+              <w:pStyle w:val="TableText"/>
+              <w:jc w:val="left"/>
+              <w:wordWrap w:val="0"/>
+              <w:spacing w:before="0" w:after="0" w:line="320" w:lineRule="exact"/>
+            </w:pPr>
+            <w:r>
+              <w:rPr>
+                <w:rFonts w:ascii="Calibri" w:hAnsi="Calibri" w:eastAsia="Microsoft YaHei" w:cs="Calibri"/>
+                <w:b/>
+                <w:sz w:val="18"/>
+                <w:szCs w:val="18"/>
+              </w:rPr>
+              <w:t xml:space="preserve">3 节点（核心）；2 CPU × 2 Socket（EP）</w:t>
+            </w:r>
+          </w:p>
+        </w:tc>
+        <w:tc>
+          <w:tcPr>
+            <w:tcW w:w="1618" w:type="dxa"/>
+          </w:tcPr>
+          <w:p>
+            <w:pPr>
+              <w:pStyle w:val="TableText"/>
+              <w:jc w:val="left"/>
+              <w:wordWrap w:val="0"/>
+              <w:spacing w:before="0" w:after="0" w:line="320" w:lineRule="exact"/>
+            </w:pPr>
+            <w:r>
+              <w:rPr>
+                <w:rFonts w:ascii="Calibri" w:hAnsi="Calibri" w:eastAsia="Microsoft YaHei" w:cs="Calibri"/>
+                <w:b/>
+                <w:sz w:val="18"/>
+                <w:szCs w:val="18"/>
+              </w:rPr>
+              <w:t xml:space="preserve">单地址核心；多地址隔离模型</w:t>
+            </w:r>
+          </w:p>
+        </w:tc>
+      </w:tr>
+    </w:tbl>
+    <w:p>
+      <w:pPr>
+        <w:ind w:left="0" w:firstLine="420"/>
+      </w:pPr>
+      <w:r>
+        <w:rPr>
+          <w:rFonts w:ascii="Calibri" w:hAnsi="Calibri" w:eastAsia="Microsoft YaHei" w:cs="Calibri"/>
+        </w:rPr>
+        <w:t xml:space="preserve">近年顶级会议的一致性形式化验证普遍采用 2–6 个请求主体的有限配置；UBCC 的形式化配置与之一致，并在 EP 双 Socket 与多地址隔离模型上继续展开。</w:t>
+      </w:r>
+    </w:p>
+    <w:p>
+      <w:pPr>
+        <w:pStyle w:val="Heading3"/>
+        <w:keepNext/>
+      </w:pPr>
+      <w:r>
+        <w:rPr>
+          <w:rFonts w:ascii="Calibri" w:hAnsi="Calibri" w:eastAsia="SimHei" w:cs="Calibri"/>
+        </w:rPr>
+        <w:t xml:space="preserve">8.4 故障注入与实现级执行对照</w:t>
+      </w:r>
+    </w:p>
+    <w:tbl>
+      <w:tblPr>
+        <w:tblStyle w:val="TableGrid"/>
+        <w:tblW w:w="5000" w:type="pct"/>
+        <w:tblLayout w:type="fixed"/>
+        <w:tblCellMar>
+          <w:top w:w="60" w:type="dxa"/>
+          <w:left w:w="90" w:type="dxa"/>
+          <w:bottom w:w="60" w:type="dxa"/>
+          <w:right w:w="90" w:type="dxa"/>
+        </w:tblCellMar>
+      </w:tblPr>
+      <w:tblGrid>
+        <w:gridCol w:w="4595"/>
+        <w:gridCol w:w="5004"/>
+      </w:tblGrid>
+      <w:tr>
+        <w:trPr>
+          <w:cantSplit/>
+          <w:tblHeader/>
+        </w:trPr>
+        <w:tc>
+          <w:tcPr>
+            <w:tcW w:w="4595" w:type="dxa"/>
+            <w:shd w:val="clear" w:color="auto" w:fill="D9E2F3"/>
+          </w:tcPr>
+          <w:p>
+            <w:pPr>
+              <w:pStyle w:val="TableText"/>
+              <w:jc w:val="left"/>
+              <w:wordWrap w:val="0"/>
+              <w:keepNext/>
+              <w:spacing w:before="0" w:after="0" w:line="320" w:lineRule="exact"/>
+            </w:pPr>
+            <w:r>
+              <w:rPr>
+                <w:rFonts w:ascii="Calibri" w:hAnsi="Calibri" w:eastAsia="SimHei" w:cs="Calibri"/>
+                <w:b/>
+                <w:sz w:val="18"/>
+                <w:szCs w:val="18"/>
+              </w:rPr>
+              <w:t xml:space="preserve">工作</w:t>
+            </w:r>
+          </w:p>
+        </w:tc>
+        <w:tc>
+          <w:tcPr>
+            <w:tcW w:w="5004" w:type="dxa"/>
+            <w:shd w:val="clear" w:color="auto" w:fill="D9E2F3"/>
+          </w:tcPr>
+          <w:p>
+            <w:pPr>
+              <w:pStyle w:val="TableText"/>
+              <w:jc w:val="left"/>
+              <w:wordWrap w:val="0"/>
+              <w:keepNext/>
+              <w:spacing w:before="0" w:after="0" w:line="320" w:lineRule="exact"/>
+            </w:pPr>
+            <w:r>
+              <w:rPr>
+                <w:rFonts w:ascii="Calibri" w:hAnsi="Calibri" w:eastAsia="SimHei" w:cs="Calibri"/>
+                <w:b/>
+                <w:sz w:val="18"/>
+                <w:szCs w:val="18"/>
+              </w:rPr>
+              <w:t xml:space="preserve">覆盖方式</w:t>
+            </w:r>
+          </w:p>
+        </w:tc>
+      </w:tr>
+      <w:tr>
+        <w:trPr>
+          <w:cantSplit/>
+        </w:trPr>
+        <w:tc>
+          <w:tcPr>
+            <w:tcW w:w="4595" w:type="dxa"/>
+          </w:tcPr>
+          <w:p>
+            <w:pPr>
+              <w:pStyle w:val="TableText"/>
+              <w:jc w:val="left"/>
+              <w:wordWrap w:val="0"/>
+              <w:keepNext/>
+              <w:spacing w:before="0" w:after="0" w:line="320" w:lineRule="exact"/>
+            </w:pPr>
+            <w:r>
+              <w:rPr>
+                <w:rFonts w:ascii="Calibri" w:hAnsi="Calibri" w:eastAsia="Microsoft YaHei" w:cs="Calibri"/>
+                <w:sz w:val="18"/>
+                <w:szCs w:val="18"/>
+              </w:rPr>
+              <w:t xml:space="preserve">C³（HPCA 2026）[1]</w:t>
+            </w:r>
+          </w:p>
+        </w:tc>
+        <w:tc>
+          <w:tcPr>
+            <w:tcW w:w="5004" w:type="dxa"/>
+          </w:tcPr>
+          <w:p>
+            <w:pPr>
+              <w:pStyle w:val="TableText"/>
+              <w:jc w:val="left"/>
+              <w:wordWrap w:val="0"/>
+              <w:keepNext/>
+              <w:spacing w:before="0" w:after="0" w:line="320" w:lineRule="exact"/>
+            </w:pPr>
+            <w:r>
+              <w:rPr>
+                <w:rFonts w:ascii="Calibri" w:hAnsi="Calibri" w:eastAsia="Microsoft YaHei" w:cs="Calibri"/>
+                <w:sz w:val="18"/>
+                <w:szCs w:val="18"/>
+              </w:rPr>
+              <w:t xml:space="preserve">Murphi 检查协议 FSM，并在 gem5 Arm O3 上执行 litmus（2 集群 × 8 O3 核）</w:t>
+            </w:r>
+          </w:p>
+        </w:tc>
+      </w:tr>
+      <w:tr>
+        <w:trPr>
+          <w:cantSplit/>
+        </w:trPr>
+        <w:tc>
+          <w:tcPr>
+            <w:tcW w:w="4595" w:type="dxa"/>
+          </w:tcPr>
+          <w:p>
+            <w:pPr>
+              <w:pStyle w:val="TableText"/>
+              <w:jc w:val="left"/>
+              <w:wordWrap w:val="0"/>
+              <w:keepNext/>
+              <w:spacing w:before="0" w:after="0" w:line="320" w:lineRule="exact"/>
+            </w:pPr>
+            <w:r>
+              <w:rPr>
+                <w:rFonts w:ascii="Calibri" w:hAnsi="Calibri" w:eastAsia="Microsoft YaHei" w:cs="Calibri"/>
+                <w:sz w:val="18"/>
+                <w:szCs w:val="18"/>
+              </w:rPr>
+              <w:t xml:space="preserve">Physalia（NSDI 2020, AWS）[5]</w:t>
+            </w:r>
+          </w:p>
+        </w:tc>
+        <w:tc>
+          <w:tcPr>
+            <w:tcW w:w="5004" w:type="dxa"/>
+          </w:tcPr>
+          <w:p>
+            <w:pPr>
+              <w:pStyle w:val="TableText"/>
+              <w:jc w:val="left"/>
+              <w:wordWrap w:val="0"/>
+              <w:keepNext/>
+              <w:spacing w:before="0" w:after="0" w:line="320" w:lineRule="exact"/>
+            </w:pPr>
+            <w:r>
+              <w:rPr>
+                <w:rFonts w:ascii="Calibri" w:hAnsi="Calibri" w:eastAsia="Microsoft YaHei" w:cs="Calibri"/>
+                <w:sz w:val="18"/>
+                <w:szCs w:val="18"/>
+              </w:rPr>
+              <w:t xml:space="preserve">TLA+/TLC + SimWorld 消息级故障控制（延迟、重复、丢弃、乱序）</w:t>
+            </w:r>
+          </w:p>
+        </w:tc>
+      </w:tr>
+      <w:tr>
+        <w:trPr>
+          <w:cantSplit/>
+        </w:trPr>
+        <w:tc>
+          <w:tcPr>
+            <w:tcW w:w="4595" w:type="dxa"/>
+          </w:tcPr>
+          <w:p>
+            <w:pPr>
+              <w:pStyle w:val="TableText"/>
+              <w:jc w:val="left"/>
+              <w:wordWrap w:val="0"/>
+              <w:keepNext/>
+              <w:spacing w:before="0" w:after="0" w:line="320" w:lineRule="exact"/>
+            </w:pPr>
+            <w:r>
+              <w:rPr>
+                <w:rFonts w:ascii="Calibri" w:hAnsi="Calibri" w:eastAsia="Microsoft YaHei" w:cs="Calibri"/>
+                <w:sz w:val="18"/>
+                <w:szCs w:val="18"/>
+              </w:rPr>
+              <w:t xml:space="preserve">ShardStore（SOSP 2021, AWS）[6]</w:t>
+            </w:r>
+          </w:p>
+        </w:tc>
+        <w:tc>
+          <w:tcPr>
+            <w:tcW w:w="5004" w:type="dxa"/>
+          </w:tcPr>
+          <w:p>
+            <w:pPr>
+              <w:pStyle w:val="TableText"/>
+              <w:jc w:val="left"/>
+              <w:wordWrap w:val="0"/>
+              <w:keepNext/>
+              <w:spacing w:before="0" w:after="0" w:line="320" w:lineRule="exact"/>
+            </w:pPr>
+            <w:r>
+              <w:rPr>
+                <w:rFonts w:ascii="Calibri" w:hAnsi="Calibri" w:eastAsia="Microsoft YaHei" w:cs="Calibri"/>
+                <w:sz w:val="18"/>
+                <w:szCs w:val="18"/>
+              </w:rPr>
+              <w:t xml:space="preserve">可执行参考模型 + 属性测试 + 无状态模型检查 + 故障注入</w:t>
+            </w:r>
+          </w:p>
+        </w:tc>
+      </w:tr>
+      <w:tr>
+        <w:trPr>
+          <w:cantSplit/>
+        </w:trPr>
+        <w:tc>
+          <w:tcPr>
+            <w:tcW w:w="4595" w:type="dxa"/>
+          </w:tcPr>
+          <w:p>
+            <w:pPr>
+              <w:pStyle w:val="TableText"/>
+              <w:jc w:val="left"/>
+              <w:wordWrap w:val="0"/>
+              <w:keepNext/>
+              <w:spacing w:before="0" w:after="0" w:line="320" w:lineRule="exact"/>
+            </w:pPr>
+            <w:r>
+              <w:rPr>
+                <w:rFonts w:ascii="Calibri" w:hAnsi="Calibri" w:eastAsia="Microsoft YaHei" w:cs="Calibri"/>
+                <w:sz w:val="18"/>
+                <w:szCs w:val="18"/>
+              </w:rPr>
+              <w:t xml:space="preserve">Concordia（FAST 2021）[7]</w:t>
+            </w:r>
+          </w:p>
+        </w:tc>
+        <w:tc>
+          <w:tcPr>
+            <w:tcW w:w="5004" w:type="dxa"/>
+          </w:tcPr>
+          <w:p>
+            <w:pPr>
+              <w:pStyle w:val="TableText"/>
+              <w:jc w:val="left"/>
+              <w:wordWrap w:val="0"/>
+              <w:keepNext/>
+              <w:spacing w:before="0" w:after="0" w:line="320" w:lineRule="exact"/>
+            </w:pPr>
+            <w:r>
+              <w:rPr>
+                <w:rFonts w:ascii="Calibri" w:hAnsi="Calibri" w:eastAsia="Microsoft YaHei" w:cs="Calibri"/>
+                <w:sz w:val="18"/>
+                <w:szCs w:val="18"/>
+              </w:rPr>
+              <w:t xml:space="preserve">交换机内一致性协议的丢包重传与幂等处理</w:t>
+            </w:r>
+          </w:p>
+        </w:tc>
+      </w:tr>
+      <w:tr>
+        <w:trPr>
+          <w:cantSplit/>
+        </w:trPr>
+        <w:tc>
+          <w:tcPr>
+            <w:tcW w:w="4595" w:type="dxa"/>
+          </w:tcPr>
+          <w:p>
+            <w:pPr>
+              <w:pStyle w:val="TableText"/>
+              <w:jc w:val="left"/>
+              <w:wordWrap w:val="0"/>
+              <w:spacing w:before="0" w:after="0" w:line="320" w:lineRule="exact"/>
+            </w:pPr>
+            <w:r>
+              <w:rPr>
+                <w:rFonts w:ascii="Calibri" w:hAnsi="Calibri" w:eastAsia="Microsoft YaHei" w:cs="Calibri"/>
+                <w:b/>
+                <w:sz w:val="18"/>
+                <w:szCs w:val="18"/>
+              </w:rPr>
+              <w:t xml:space="preserve">UBCC</w:t>
+            </w:r>
+          </w:p>
+        </w:tc>
+        <w:tc>
+          <w:tcPr>
+            <w:tcW w:w="5004" w:type="dxa"/>
+          </w:tcPr>
+          <w:p>
+            <w:pPr>
+              <w:pStyle w:val="TableText"/>
+              <w:jc w:val="left"/>
+              <w:wordWrap w:val="0"/>
+              <w:spacing w:before="0" w:after="0" w:line="320" w:lineRule="exact"/>
+            </w:pPr>
+            <w:r>
+              <w:rPr>
+                <w:rFonts w:ascii="Calibri" w:hAnsi="Calibri" w:eastAsia="Microsoft YaHei" w:cs="Calibri"/>
+                <w:b/>
+                <w:sz w:val="18"/>
+                <w:szCs w:val="18"/>
+              </w:rPr>
+              <w:t xml:space="preserve">分层 TLA+ + O3/多拓扑端到端执行 + 52 项结构化消息故障矩阵</w:t>
+            </w:r>
+          </w:p>
+        </w:tc>
+      </w:tr>
+    </w:tbl>
+    <w:p>
+      <w:pPr>
+        <w:ind w:left="0" w:firstLine="420"/>
+      </w:pPr>
+      <w:r>
+        <w:rPr>
+          <w:rFonts w:ascii="Calibri" w:hAnsi="Calibri" w:eastAsia="Microsoft YaHei" w:cs="Calibri"/>
+        </w:rPr>
+        <w:t xml:space="preserve">UBCC 的故障矩阵按故障动作（丢失、延迟、重复、乱序）、事务类别（Clear/ClearAck、Upgrade、Invalidate、Recall）、故障结构（连续、成对、组合）与拓扑（3N1S、3N2S、8N2S、16N1S）组织，覆盖 AWS Physalia、Concordia 等工业工作所关注的同类消息异常与恢复路径。</w:t>
+      </w:r>
+    </w:p>
+    <w:p>
+      <w:pPr>
+        <w:pStyle w:val="Heading3"/>
+        <w:keepNext/>
+      </w:pPr>
+      <w:r>
+        <w:rPr>
+          <w:rFonts w:ascii="Calibri" w:hAnsi="Calibri" w:eastAsia="SimHei" w:cs="Calibri"/>
+        </w:rPr>
+        <w:t xml:space="preserve">8.5 对照结论</w:t>
+      </w:r>
+    </w:p>
+    <w:p>
+      <w:pPr>
+        <w:ind w:left="0" w:firstLine="420"/>
+      </w:pPr>
+      <w:r>
+        <w:rPr>
+          <w:rFonts w:ascii="Calibri" w:hAnsi="Calibri" w:eastAsia="Microsoft YaHei" w:cs="Calibri"/>
+        </w:rPr>
+        <w:t xml:space="preserve">UBCC 的形式化验证状态空间（约 2100 万；EP 模型 5200 万–7400 万）与公开工业 TLA+ 缓存一致性案例（Alpha EV6/EV7，600 万–1200 万）处于同一数量级并覆盖更大的状态空间；其形式化配置（3 节点、单地址，另有 EP 双 Socket 与多地址隔离模型）与近年顶会 CXL 一致性工作的实例规模一致；其实现级执行与消息故障注入覆盖丢失、延迟、重复、乱序、连续、成对、并发与四类拓扑，与 AWS 公开的“形式化 + 定向故障注入”工业实践对应。</w:t>
+      </w:r>
+      <w:r>
+        <w:rPr>
+          <w:rFonts w:ascii="Calibri" w:hAnsi="Calibri" w:eastAsia="Microsoft YaHei" w:cs="Calibri"/>
+          <w:b/>
+        </w:rPr>
+        <w:t xml:space="preserve">UBCC 的验证规模与范围与公开的学术与工业权威工作在数量级与覆盖维度上一致，并在多地址隔离、snoop 仲裁、waiter 精确退役与多拓扑执行等方向形成独立覆盖。</w:t>
       </w:r>
     </w:p>
     <w:p>
@@ -7045,7 +9333,7 @@
         <w:rPr>
           <w:rFonts w:ascii="Calibri" w:hAnsi="Calibri" w:eastAsia="SimHei" w:cs="Calibri"/>
         </w:rPr>
-        <w:t xml:space="preserve">9. 总结</w:t>
+        <w:t xml:space="preserve">9. 交付内容</w:t>
       </w:r>
     </w:p>
     <w:p>
@@ -7056,7 +9344,96 @@
         <w:rPr>
           <w:rFonts w:ascii="Calibri" w:hAnsi="Calibri" w:eastAsia="Microsoft YaHei" w:cs="Calibri"/>
         </w:rPr>
-        <w:t xml:space="preserve">UBCC 已建立从形式化模型到端到端执行的分层验证体系。目录提交、同址事务、消息幂等、 失效收敛和 snoop 仲裁均获得明确验证；Q1-Q5 故障资格矩阵 52/52 通过，多拓扑和 O3 验证进一步确认了实现的工程适用性。</w:t>
+        <w:t xml:space="preserve">本次交付覆盖：</w:t>
+      </w:r>
+    </w:p>
+    <w:p>
+      <w:pPr>
+        <w:ind w:left="360" w:firstLine="0"/>
+      </w:pPr>
+      <w:r>
+        <w:rPr>
+          <w:rFonts w:ascii="Calibri" w:hAnsi="Calibri" w:eastAsia="Microsoft YaHei" w:cs="Calibri"/>
+        </w:rPr>
+        <w:t xml:space="preserve">• UBCC 目录状态与关键活性机制；</w:t>
+      </w:r>
+    </w:p>
+    <w:p>
+      <w:pPr>
+        <w:ind w:left="360" w:firstLine="0"/>
+      </w:pPr>
+      <w:r>
+        <w:rPr>
+          <w:rFonts w:ascii="Calibri" w:hAnsi="Calibri" w:eastAsia="Microsoft YaHei" w:cs="Calibri"/>
+        </w:rPr>
+        <w:t xml:space="preserve">• EP-RNF、EP-SNF 和 UBAdapter 协同；</w:t>
+      </w:r>
+    </w:p>
+    <w:p>
+      <w:pPr>
+        <w:ind w:left="360" w:firstLine="0"/>
+      </w:pPr>
+      <w:r>
+        <w:rPr>
+          <w:rFonts w:ascii="Calibri" w:hAnsi="Calibri" w:eastAsia="Microsoft YaHei" w:cs="Calibri"/>
+        </w:rPr>
+        <w:t xml:space="preserve">• 可恢复消息传输故障；</w:t>
+      </w:r>
+    </w:p>
+    <w:p>
+      <w:pPr>
+        <w:ind w:left="360" w:firstLine="0"/>
+      </w:pPr>
+      <w:r>
+        <w:rPr>
+          <w:rFonts w:ascii="Calibri" w:hAnsi="Calibri" w:eastAsia="Microsoft YaHei" w:cs="Calibri"/>
+        </w:rPr>
+        <w:t xml:space="preserve">• 3N1S、3N2S、8N2S 和 16N1S 代表拓扑；</w:t>
+      </w:r>
+    </w:p>
+    <w:p>
+      <w:pPr>
+        <w:ind w:left="360" w:firstLine="0"/>
+      </w:pPr>
+      <w:r>
+        <w:rPr>
+          <w:rFonts w:ascii="Calibri" w:hAnsi="Calibri" w:eastAsia="Microsoft YaHei" w:cs="Calibri"/>
+        </w:rPr>
+        <w:t xml:space="preserve">• O3 处理器模型下的同步语义；</w:t>
+      </w:r>
+    </w:p>
+    <w:p>
+      <w:pPr>
+        <w:ind w:left="360" w:firstLine="0"/>
+      </w:pPr>
+      <w:r>
+        <w:rPr>
+          <w:rFonts w:ascii="Calibri" w:hAnsi="Calibri" w:eastAsia="Microsoft YaHei" w:cs="Calibri"/>
+        </w:rPr>
+        <w:t xml:space="preserve">• 性能矩阵执行前的正确性测试。</w:t>
+      </w:r>
+    </w:p>
+    <w:p>
+      <w:pPr>
+        <w:pStyle w:val="Heading2"/>
+        <w:keepNext/>
+      </w:pPr>
+      <w:r>
+        <w:rPr>
+          <w:rFonts w:ascii="Calibri" w:hAnsi="Calibri" w:eastAsia="SimHei" w:cs="Calibri"/>
+        </w:rPr>
+        <w:t xml:space="preserve">10. 总结</w:t>
+      </w:r>
+    </w:p>
+    <w:p>
+      <w:pPr>
+        <w:ind w:left="0" w:firstLine="420"/>
+      </w:pPr>
+      <w:r>
+        <w:rPr>
+          <w:rFonts w:ascii="Calibri" w:hAnsi="Calibri" w:eastAsia="Microsoft YaHei" w:cs="Calibri"/>
+        </w:rPr>
+        <w:t xml:space="preserve">UBCC 已建立从形式化模型到端到端执行的分层验证体系。目录提交、同址事务、消息幂等、 失效收敛和 snoop 仲裁均获得明确验证；G1–G5 故障资格矩阵 52/52 通过，多拓扑和 O3 验证进一步确认了实现的工程适用性。</w:t>
       </w:r>
     </w:p>
     <w:p>
@@ -7883,10 +10260,10 @@
         </w:tblCellMar>
       </w:tblPr>
       <w:tblGrid>
-        <w:gridCol w:w="1195"/>
-        <w:gridCol w:w="2377"/>
-        <w:gridCol w:w="3559"/>
-        <w:gridCol w:w="2468"/>
+        <w:gridCol w:w="1306"/>
+        <w:gridCol w:w="1306"/>
+        <w:gridCol w:w="4150"/>
+        <w:gridCol w:w="2837"/>
       </w:tblGrid>
       <w:tr>
         <w:trPr>
@@ -7895,7 +10272,7 @@
         </w:trPr>
         <w:tc>
           <w:tcPr>
-            <w:tcW w:w="1195" w:type="dxa"/>
+            <w:tcW w:w="1306" w:type="dxa"/>
             <w:shd w:val="clear" w:color="auto" w:fill="D9E2F3"/>
           </w:tcPr>
           <w:p>
@@ -7919,7 +10296,7 @@
         </w:tc>
         <w:tc>
           <w:tcPr>
-            <w:tcW w:w="2377" w:type="dxa"/>
+            <w:tcW w:w="1306" w:type="dxa"/>
             <w:shd w:val="clear" w:color="auto" w:fill="D9E2F3"/>
           </w:tcPr>
           <w:p>
@@ -7943,7 +10320,7 @@
         </w:tc>
         <w:tc>
           <w:tcPr>
-            <w:tcW w:w="3559" w:type="dxa"/>
+            <w:tcW w:w="4150" w:type="dxa"/>
             <w:shd w:val="clear" w:color="auto" w:fill="D9E2F3"/>
           </w:tcPr>
           <w:p>
@@ -7967,7 +10344,7 @@
         </w:tc>
         <w:tc>
           <w:tcPr>
-            <w:tcW w:w="2468" w:type="dxa"/>
+            <w:tcW w:w="2837" w:type="dxa"/>
             <w:shd w:val="clear" w:color="auto" w:fill="D9E2F3"/>
           </w:tcPr>
           <w:p>
@@ -7996,51 +10373,51 @@
         </w:trPr>
         <w:tc>
           <w:tcPr>
-            <w:tcW w:w="1195" w:type="dxa"/>
-          </w:tcPr>
-          <w:p>
-            <w:pPr>
-              <w:pStyle w:val="TableText"/>
-              <w:jc w:val="left"/>
-              <w:wordWrap w:val="0"/>
-              <w:keepNext/>
-              <w:spacing w:before="0" w:after="0" w:line="320" w:lineRule="exact"/>
-            </w:pPr>
-            <w:r>
-              <w:rPr>
-                <w:rFonts w:ascii="Calibri" w:hAnsi="Calibri" w:eastAsia="Microsoft YaHei" w:cs="Calibri"/>
-                <w:sz w:val="18"/>
-                <w:szCs w:val="18"/>
-              </w:rPr>
-              <w:t xml:space="preserve">Q1</w:t>
-            </w:r>
-          </w:p>
-        </w:tc>
-        <w:tc>
-          <w:tcPr>
-            <w:tcW w:w="2377" w:type="dxa"/>
-          </w:tcPr>
-          <w:p>
-            <w:pPr>
-              <w:pStyle w:val="TableText"/>
-              <w:jc w:val="left"/>
-              <w:wordWrap w:val="0"/>
-              <w:keepNext/>
-              <w:spacing w:before="0" w:after="0" w:line="320" w:lineRule="exact"/>
-            </w:pPr>
-            <w:r>
-              <w:rPr>
-                <w:rFonts w:ascii="Calibri" w:hAnsi="Calibri" w:eastAsia="Microsoft YaHei" w:cs="Calibri"/>
-                <w:sz w:val="18"/>
-                <w:szCs w:val="18"/>
-              </w:rPr>
-              <w:t xml:space="preserve">单故障基础集</w:t>
-            </w:r>
-          </w:p>
-        </w:tc>
-        <w:tc>
-          <w:tcPr>
-            <w:tcW w:w="3559" w:type="dxa"/>
+            <w:tcW w:w="1306" w:type="dxa"/>
+          </w:tcPr>
+          <w:p>
+            <w:pPr>
+              <w:pStyle w:val="TableText"/>
+              <w:jc w:val="left"/>
+              <w:wordWrap w:val="0"/>
+              <w:keepNext/>
+              <w:spacing w:before="0" w:after="0" w:line="320" w:lineRule="exact"/>
+            </w:pPr>
+            <w:r>
+              <w:rPr>
+                <w:rFonts w:ascii="Calibri" w:hAnsi="Calibri" w:eastAsia="Microsoft YaHei" w:cs="Calibri"/>
+                <w:sz w:val="18"/>
+                <w:szCs w:val="18"/>
+              </w:rPr>
+              <w:t xml:space="preserve">G1</w:t>
+            </w:r>
+          </w:p>
+        </w:tc>
+        <w:tc>
+          <w:tcPr>
+            <w:tcW w:w="1306" w:type="dxa"/>
+          </w:tcPr>
+          <w:p>
+            <w:pPr>
+              <w:pStyle w:val="TableText"/>
+              <w:jc w:val="left"/>
+              <w:wordWrap w:val="0"/>
+              <w:keepNext/>
+              <w:spacing w:before="0" w:after="0" w:line="320" w:lineRule="exact"/>
+            </w:pPr>
+            <w:r>
+              <w:rPr>
+                <w:rFonts w:ascii="Calibri" w:hAnsi="Calibri" w:eastAsia="Microsoft YaHei" w:cs="Calibri"/>
+                <w:sz w:val="18"/>
+                <w:szCs w:val="18"/>
+              </w:rPr>
+              <w:t xml:space="preserve">单消息传输</w:t>
+            </w:r>
+          </w:p>
+        </w:tc>
+        <w:tc>
+          <w:tcPr>
+            <w:tcW w:w="4150" w:type="dxa"/>
           </w:tcPr>
           <w:p>
             <w:pPr>
@@ -8062,7 +10439,7 @@
         </w:tc>
         <w:tc>
           <w:tcPr>
-            <w:tcW w:w="2468" w:type="dxa"/>
+            <w:tcW w:w="2837" w:type="dxa"/>
           </w:tcPr>
           <w:p>
             <w:pPr>
@@ -8089,29 +10466,29 @@
         </w:trPr>
         <w:tc>
           <w:tcPr>
-            <w:tcW w:w="1195" w:type="dxa"/>
-          </w:tcPr>
-          <w:p>
-            <w:pPr>
-              <w:pStyle w:val="TableText"/>
-              <w:jc w:val="left"/>
-              <w:wordWrap w:val="0"/>
-              <w:keepNext/>
-              <w:spacing w:before="0" w:after="0" w:line="320" w:lineRule="exact"/>
-            </w:pPr>
-            <w:r>
-              <w:rPr>
-                <w:rFonts w:ascii="Calibri" w:hAnsi="Calibri" w:eastAsia="Microsoft YaHei" w:cs="Calibri"/>
-                <w:sz w:val="18"/>
-                <w:szCs w:val="18"/>
-              </w:rPr>
-              <w:t xml:space="preserve">Q2</w:t>
-            </w:r>
-          </w:p>
-        </w:tc>
-        <w:tc>
-          <w:tcPr>
-            <w:tcW w:w="2377" w:type="dxa"/>
+            <w:tcW w:w="1306" w:type="dxa"/>
+          </w:tcPr>
+          <w:p>
+            <w:pPr>
+              <w:pStyle w:val="TableText"/>
+              <w:jc w:val="left"/>
+              <w:wordWrap w:val="0"/>
+              <w:keepNext/>
+              <w:spacing w:before="0" w:after="0" w:line="320" w:lineRule="exact"/>
+            </w:pPr>
+            <w:r>
+              <w:rPr>
+                <w:rFonts w:ascii="Calibri" w:hAnsi="Calibri" w:eastAsia="Microsoft YaHei" w:cs="Calibri"/>
+                <w:sz w:val="18"/>
+                <w:szCs w:val="18"/>
+              </w:rPr>
+              <w:t xml:space="preserve">G2</w:t>
+            </w:r>
+          </w:p>
+        </w:tc>
+        <w:tc>
+          <w:tcPr>
+            <w:tcW w:w="1306" w:type="dxa"/>
           </w:tcPr>
           <w:p>
             <w:pPr>
@@ -8133,7 +10510,7 @@
         </w:tc>
         <w:tc>
           <w:tcPr>
-            <w:tcW w:w="3559" w:type="dxa"/>
+            <w:tcW w:w="4150" w:type="dxa"/>
           </w:tcPr>
           <w:p>
             <w:pPr>
@@ -8155,7 +10532,7 @@
         </w:tc>
         <w:tc>
           <w:tcPr>
-            <w:tcW w:w="2468" w:type="dxa"/>
+            <w:tcW w:w="2837" w:type="dxa"/>
           </w:tcPr>
           <w:p>
             <w:pPr>
@@ -8182,51 +10559,51 @@
         </w:trPr>
         <w:tc>
           <w:tcPr>
-            <w:tcW w:w="1195" w:type="dxa"/>
-          </w:tcPr>
-          <w:p>
-            <w:pPr>
-              <w:pStyle w:val="TableText"/>
-              <w:jc w:val="left"/>
-              <w:wordWrap w:val="0"/>
-              <w:keepNext/>
-              <w:spacing w:before="0" w:after="0" w:line="320" w:lineRule="exact"/>
-            </w:pPr>
-            <w:r>
-              <w:rPr>
-                <w:rFonts w:ascii="Calibri" w:hAnsi="Calibri" w:eastAsia="Microsoft YaHei" w:cs="Calibri"/>
-                <w:sz w:val="18"/>
-                <w:szCs w:val="18"/>
-              </w:rPr>
-              <w:t xml:space="preserve">Q3</w:t>
-            </w:r>
-          </w:p>
-        </w:tc>
-        <w:tc>
-          <w:tcPr>
-            <w:tcW w:w="2377" w:type="dxa"/>
-          </w:tcPr>
-          <w:p>
-            <w:pPr>
-              <w:pStyle w:val="TableText"/>
-              <w:jc w:val="left"/>
-              <w:wordWrap w:val="0"/>
-              <w:keepNext/>
-              <w:spacing w:before="0" w:after="0" w:line="320" w:lineRule="exact"/>
-            </w:pPr>
-            <w:r>
-              <w:rPr>
-                <w:rFonts w:ascii="Calibri" w:hAnsi="Calibri" w:eastAsia="Microsoft YaHei" w:cs="Calibri"/>
-                <w:sz w:val="18"/>
-                <w:szCs w:val="18"/>
-              </w:rPr>
-              <w:t xml:space="preserve">双故障组合</w:t>
-            </w:r>
-          </w:p>
-        </w:tc>
-        <w:tc>
-          <w:tcPr>
-            <w:tcW w:w="3559" w:type="dxa"/>
+            <w:tcW w:w="1306" w:type="dxa"/>
+          </w:tcPr>
+          <w:p>
+            <w:pPr>
+              <w:pStyle w:val="TableText"/>
+              <w:jc w:val="left"/>
+              <w:wordWrap w:val="0"/>
+              <w:keepNext/>
+              <w:spacing w:before="0" w:after="0" w:line="320" w:lineRule="exact"/>
+            </w:pPr>
+            <w:r>
+              <w:rPr>
+                <w:rFonts w:ascii="Calibri" w:hAnsi="Calibri" w:eastAsia="Microsoft YaHei" w:cs="Calibri"/>
+                <w:sz w:val="18"/>
+                <w:szCs w:val="18"/>
+              </w:rPr>
+              <w:t xml:space="preserve">G3</w:t>
+            </w:r>
+          </w:p>
+        </w:tc>
+        <w:tc>
+          <w:tcPr>
+            <w:tcW w:w="1306" w:type="dxa"/>
+          </w:tcPr>
+          <w:p>
+            <w:pPr>
+              <w:pStyle w:val="TableText"/>
+              <w:jc w:val="left"/>
+              <w:wordWrap w:val="0"/>
+              <w:keepNext/>
+              <w:spacing w:before="0" w:after="0" w:line="320" w:lineRule="exact"/>
+            </w:pPr>
+            <w:r>
+              <w:rPr>
+                <w:rFonts w:ascii="Calibri" w:hAnsi="Calibri" w:eastAsia="Microsoft YaHei" w:cs="Calibri"/>
+                <w:sz w:val="18"/>
+                <w:szCs w:val="18"/>
+              </w:rPr>
+              <w:t xml:space="preserve">成对依赖</w:t>
+            </w:r>
+          </w:p>
+        </w:tc>
+        <w:tc>
+          <w:tcPr>
+            <w:tcW w:w="4150" w:type="dxa"/>
           </w:tcPr>
           <w:p>
             <w:pPr>
@@ -8248,7 +10625,7 @@
         </w:tc>
         <w:tc>
           <w:tcPr>
-            <w:tcW w:w="2468" w:type="dxa"/>
+            <w:tcW w:w="2837" w:type="dxa"/>
           </w:tcPr>
           <w:p>
             <w:pPr>
@@ -8275,51 +10652,51 @@
         </w:trPr>
         <w:tc>
           <w:tcPr>
-            <w:tcW w:w="1195" w:type="dxa"/>
-          </w:tcPr>
-          <w:p>
-            <w:pPr>
-              <w:pStyle w:val="TableText"/>
-              <w:jc w:val="left"/>
-              <w:wordWrap w:val="0"/>
-              <w:keepNext/>
-              <w:spacing w:before="0" w:after="0" w:line="320" w:lineRule="exact"/>
-            </w:pPr>
-            <w:r>
-              <w:rPr>
-                <w:rFonts w:ascii="Calibri" w:hAnsi="Calibri" w:eastAsia="Microsoft YaHei" w:cs="Calibri"/>
-                <w:sz w:val="18"/>
-                <w:szCs w:val="18"/>
-              </w:rPr>
-              <w:t xml:space="preserve">Q4</w:t>
-            </w:r>
-          </w:p>
-        </w:tc>
-        <w:tc>
-          <w:tcPr>
-            <w:tcW w:w="2377" w:type="dxa"/>
-          </w:tcPr>
-          <w:p>
-            <w:pPr>
-              <w:pStyle w:val="TableText"/>
-              <w:jc w:val="left"/>
-              <w:wordWrap w:val="0"/>
-              <w:keepNext/>
-              <w:spacing w:before="0" w:after="0" w:line="320" w:lineRule="exact"/>
-            </w:pPr>
-            <w:r>
-              <w:rPr>
-                <w:rFonts w:ascii="Calibri" w:hAnsi="Calibri" w:eastAsia="Microsoft YaHei" w:cs="Calibri"/>
-                <w:sz w:val="18"/>
-                <w:szCs w:val="18"/>
-              </w:rPr>
-              <w:t xml:space="preserve">burst / concurrency</w:t>
-            </w:r>
-          </w:p>
-        </w:tc>
-        <w:tc>
-          <w:tcPr>
-            <w:tcW w:w="3559" w:type="dxa"/>
+            <w:tcW w:w="1306" w:type="dxa"/>
+          </w:tcPr>
+          <w:p>
+            <w:pPr>
+              <w:pStyle w:val="TableText"/>
+              <w:jc w:val="left"/>
+              <w:wordWrap w:val="0"/>
+              <w:keepNext/>
+              <w:spacing w:before="0" w:after="0" w:line="320" w:lineRule="exact"/>
+            </w:pPr>
+            <w:r>
+              <w:rPr>
+                <w:rFonts w:ascii="Calibri" w:hAnsi="Calibri" w:eastAsia="Microsoft YaHei" w:cs="Calibri"/>
+                <w:sz w:val="18"/>
+                <w:szCs w:val="18"/>
+              </w:rPr>
+              <w:t xml:space="preserve">G4</w:t>
+            </w:r>
+          </w:p>
+        </w:tc>
+        <w:tc>
+          <w:tcPr>
+            <w:tcW w:w="1306" w:type="dxa"/>
+          </w:tcPr>
+          <w:p>
+            <w:pPr>
+              <w:pStyle w:val="TableText"/>
+              <w:jc w:val="left"/>
+              <w:wordWrap w:val="0"/>
+              <w:keepNext/>
+              <w:spacing w:before="0" w:after="0" w:line="320" w:lineRule="exact"/>
+            </w:pPr>
+            <w:r>
+              <w:rPr>
+                <w:rFonts w:ascii="Calibri" w:hAnsi="Calibri" w:eastAsia="Microsoft YaHei" w:cs="Calibri"/>
+                <w:sz w:val="18"/>
+                <w:szCs w:val="18"/>
+              </w:rPr>
+              <w:t xml:space="preserve">并发与聚合</w:t>
+            </w:r>
+          </w:p>
+        </w:tc>
+        <w:tc>
+          <w:tcPr>
+            <w:tcW w:w="4150" w:type="dxa"/>
           </w:tcPr>
           <w:p>
             <w:pPr>
@@ -8341,7 +10718,7 @@
         </w:tc>
         <w:tc>
           <w:tcPr>
-            <w:tcW w:w="2468" w:type="dxa"/>
+            <w:tcW w:w="2837" w:type="dxa"/>
           </w:tcPr>
           <w:p>
             <w:pPr>
@@ -8368,49 +10745,49 @@
         </w:trPr>
         <w:tc>
           <w:tcPr>
-            <w:tcW w:w="1195" w:type="dxa"/>
-          </w:tcPr>
-          <w:p>
-            <w:pPr>
-              <w:pStyle w:val="TableText"/>
-              <w:jc w:val="left"/>
-              <w:wordWrap w:val="0"/>
-              <w:spacing w:before="0" w:after="0" w:line="320" w:lineRule="exact"/>
-            </w:pPr>
-            <w:r>
-              <w:rPr>
-                <w:rFonts w:ascii="Calibri" w:hAnsi="Calibri" w:eastAsia="Microsoft YaHei" w:cs="Calibri"/>
-                <w:sz w:val="18"/>
-                <w:szCs w:val="18"/>
-              </w:rPr>
-              <w:t xml:space="preserve">Q5</w:t>
-            </w:r>
-          </w:p>
-        </w:tc>
-        <w:tc>
-          <w:tcPr>
-            <w:tcW w:w="2377" w:type="dxa"/>
-          </w:tcPr>
-          <w:p>
-            <w:pPr>
-              <w:pStyle w:val="TableText"/>
-              <w:jc w:val="left"/>
-              <w:wordWrap w:val="0"/>
-              <w:spacing w:before="0" w:after="0" w:line="320" w:lineRule="exact"/>
-            </w:pPr>
-            <w:r>
-              <w:rPr>
-                <w:rFonts w:ascii="Calibri" w:hAnsi="Calibri" w:eastAsia="Microsoft YaHei" w:cs="Calibri"/>
-                <w:sz w:val="18"/>
-                <w:szCs w:val="18"/>
-              </w:rPr>
-              <w:t xml:space="preserve">topology</w:t>
-            </w:r>
-          </w:p>
-        </w:tc>
-        <w:tc>
-          <w:tcPr>
-            <w:tcW w:w="3559" w:type="dxa"/>
+            <w:tcW w:w="1306" w:type="dxa"/>
+          </w:tcPr>
+          <w:p>
+            <w:pPr>
+              <w:pStyle w:val="TableText"/>
+              <w:jc w:val="left"/>
+              <w:wordWrap w:val="0"/>
+              <w:spacing w:before="0" w:after="0" w:line="320" w:lineRule="exact"/>
+            </w:pPr>
+            <w:r>
+              <w:rPr>
+                <w:rFonts w:ascii="Calibri" w:hAnsi="Calibri" w:eastAsia="Microsoft YaHei" w:cs="Calibri"/>
+                <w:sz w:val="18"/>
+                <w:szCs w:val="18"/>
+              </w:rPr>
+              <w:t xml:space="preserve">G5</w:t>
+            </w:r>
+          </w:p>
+        </w:tc>
+        <w:tc>
+          <w:tcPr>
+            <w:tcW w:w="1306" w:type="dxa"/>
+          </w:tcPr>
+          <w:p>
+            <w:pPr>
+              <w:pStyle w:val="TableText"/>
+              <w:jc w:val="left"/>
+              <w:wordWrap w:val="0"/>
+              <w:spacing w:before="0" w:after="0" w:line="320" w:lineRule="exact"/>
+            </w:pPr>
+            <w:r>
+              <w:rPr>
+                <w:rFonts w:ascii="Calibri" w:hAnsi="Calibri" w:eastAsia="Microsoft YaHei" w:cs="Calibri"/>
+                <w:sz w:val="18"/>
+                <w:szCs w:val="18"/>
+              </w:rPr>
+              <w:t xml:space="preserve">多拓扑</w:t>
+            </w:r>
+          </w:p>
+        </w:tc>
+        <w:tc>
+          <w:tcPr>
+            <w:tcW w:w="4150" w:type="dxa"/>
           </w:tcPr>
           <w:p>
             <w:pPr>
@@ -8431,7 +10808,7 @@
         </w:tc>
         <w:tc>
           <w:tcPr>
-            <w:tcW w:w="2468" w:type="dxa"/>
+            <w:tcW w:w="2837" w:type="dxa"/>
           </w:tcPr>
           <w:p>
             <w:pPr>
@@ -9092,7 +11469,7 @@
                 <w:sz w:val="18"/>
                 <w:szCs w:val="18"/>
               </w:rPr>
-              <w:t xml:space="preserve">Q1-Q5</w:t>
+              <w:t xml:space="preserve">G1–G5</w:t>
             </w:r>
           </w:p>
         </w:tc>
@@ -9113,7 +11490,7 @@
                 <w:sz w:val="18"/>
                 <w:szCs w:val="18"/>
               </w:rPr>
-              <w:t xml:space="preserve">从基础单故障到多拓扑故障的五级测试分组</w:t>
+              <w:t xml:space="preserve">从单消息传输故障到多拓扑故障的五级测试分组</w:t>
             </w:r>
           </w:p>
         </w:tc>
@@ -9386,6 +11763,150 @@
         </w:tc>
       </w:tr>
     </w:tbl>
+    <w:p>
+      <w:pPr>
+        <w:pStyle w:val="Heading2"/>
+        <w:keepNext/>
+      </w:pPr>
+      <w:r>
+        <w:rPr>
+          <w:rFonts w:ascii="Calibri" w:hAnsi="Calibri" w:eastAsia="SimHei" w:cs="Calibri"/>
+        </w:rPr>
+        <w:t xml:space="preserve">附录 E 参考文献</w:t>
+      </w:r>
+    </w:p>
+    <w:p>
+      <w:pPr>
+        <w:ind w:left="0" w:firstLine="420"/>
+      </w:pPr>
+      <w:r>
+        <w:rPr>
+          <w:rFonts w:ascii="Calibri" w:hAnsi="Calibri" w:eastAsia="Microsoft YaHei" w:cs="Calibri"/>
+        </w:rPr>
+        <w:t xml:space="preserve">本节列出第 8 章「验证规模与范围对照」所引用的公开工作。</w:t>
+      </w:r>
+    </w:p>
+    <w:p>
+      <w:pPr>
+        <w:ind w:left="0" w:firstLine="420"/>
+      </w:pPr>
+      <w:r>
+        <w:rPr>
+          <w:rFonts w:ascii="Calibri" w:hAnsi="Calibri" w:eastAsia="Microsoft YaHei" w:cs="Calibri"/>
+        </w:rPr>
+        <w:t xml:space="preserve">1. C³: CXL Coherence Controllers for Heterogeneous Architectures. HPCA 2026. &lt;https://2026.hpca-conf.org/details/hpca-2026-main-conference/5/-C-3-CXL-Coherence-Controllers-for-Heterogeneous-Architectures&gt;</w:t>
+      </w:r>
+    </w:p>
+    <w:p>
+      <w:pPr>
+        <w:ind w:left="0" w:firstLine="420"/>
+      </w:pPr>
+      <w:r>
+        <w:rPr>
+          <w:rFonts w:ascii="Calibri" w:hAnsi="Calibri" w:eastAsia="Microsoft YaHei" w:cs="Calibri"/>
+        </w:rPr>
+        <w:t xml:space="preserve">2. vCXLGen: Automated Synthesis and Verification of CXL Bridges for Heterogeneous Architectures. ASPLOS 2026. &lt;https://doi.org/10.1145/3779212.3790245&gt;</w:t>
+      </w:r>
+    </w:p>
+    <w:p>
+      <w:pPr>
+        <w:ind w:left="0" w:firstLine="420"/>
+      </w:pPr>
+      <w:r>
+        <w:rPr>
+          <w:rFonts w:ascii="Calibri" w:hAnsi="Calibri" w:eastAsia="Microsoft YaHei" w:cs="Calibri"/>
+        </w:rPr>
+        <w:t xml:space="preserve">3. Formalising CXL Cache Coherence. ASPLOS 2025. &lt;https://doi.org/10.1145/3676641.3715999&gt;</w:t>
+      </w:r>
+    </w:p>
+    <w:p>
+      <w:pPr>
+        <w:ind w:left="0" w:firstLine="420"/>
+      </w:pPr>
+      <w:r>
+        <w:rPr>
+          <w:rFonts w:ascii="Calibri" w:hAnsi="Calibri" w:eastAsia="Microsoft YaHei" w:cs="Calibri"/>
+        </w:rPr>
+        <w:t xml:space="preserve">4. Hemiola: A DSL and Verification Tools to Guide Design and Proof of Hierarchical Cache-Coherence Protocols. CAV 2022. &lt;https://link.springer.com/chapter/10.1007/978-3-031-13188-2_16&gt;</w:t>
+      </w:r>
+    </w:p>
+    <w:p>
+      <w:pPr>
+        <w:ind w:left="0" w:firstLine="420"/>
+      </w:pPr>
+      <w:r>
+        <w:rPr>
+          <w:rFonts w:ascii="Calibri" w:hAnsi="Calibri" w:eastAsia="Microsoft YaHei" w:cs="Calibri"/>
+        </w:rPr>
+        <w:t xml:space="preserve">5. Millions of Tiny Databases (Physalia). NSDI 2020. &lt;https://www.usenix.org/system/files/nsdi20-paper-brooker.pdf&gt;</w:t>
+      </w:r>
+    </w:p>
+    <w:p>
+      <w:pPr>
+        <w:ind w:left="0" w:firstLine="420"/>
+      </w:pPr>
+      <w:r>
+        <w:rPr>
+          <w:rFonts w:ascii="Calibri" w:hAnsi="Calibri" w:eastAsia="Microsoft YaHei" w:cs="Calibri"/>
+        </w:rPr>
+        <w:t xml:space="preserve">6. Using Lightweight Formal Methods to Validate a Key-Value Storage Node in Amazon S3 (ShardStore). SOSP 2021. &lt;https://doi.org/10.1145/3477132.3483540&gt;</w:t>
+      </w:r>
+    </w:p>
+    <w:p>
+      <w:pPr>
+        <w:ind w:left="0" w:firstLine="420"/>
+      </w:pPr>
+      <w:r>
+        <w:rPr>
+          <w:rFonts w:ascii="Calibri" w:hAnsi="Calibri" w:eastAsia="Microsoft YaHei" w:cs="Calibri"/>
+        </w:rPr>
+        <w:t xml:space="preserve">7. Concordia: Distributed Shared Memory with In-Network Cache Coherence. FAST 2021. &lt;https://www.usenix.org/system/files/fast21-wang.pdf&gt;</w:t>
+      </w:r>
+    </w:p>
+    <w:p>
+      <w:pPr>
+        <w:ind w:left="0" w:firstLine="420"/>
+      </w:pPr>
+      <w:r>
+        <w:rPr>
+          <w:rFonts w:ascii="Calibri" w:hAnsi="Calibri" w:eastAsia="Microsoft YaHei" w:cs="Calibri"/>
+        </w:rPr>
+        <w:t xml:space="preserve">8. Checking Cache-Coherence Protocols with TLA+. Formal Methods in System Design, 22:125–131, 2003. &lt;https://www.microsoft.com/en-us/research/publication/checking-cache-coherence-protocols-with-tla/&gt;</w:t>
+      </w:r>
+    </w:p>
+    <w:p>
+      <w:pPr>
+        <w:ind w:left="0" w:firstLine="420"/>
+      </w:pPr>
+      <w:r>
+        <w:rPr>
+          <w:rFonts w:ascii="Calibri" w:hAnsi="Calibri" w:eastAsia="Microsoft YaHei" w:cs="Calibri"/>
+        </w:rPr>
+        <w:t xml:space="preserve">9. HieraGen: Automated Generation of Concurrent, Hierarchical Cache Coherence Protocols. ISCA 2020.</w:t>
+      </w:r>
+    </w:p>
+    <w:p>
+      <w:pPr>
+        <w:ind w:left="0" w:firstLine="420"/>
+      </w:pPr>
+      <w:r>
+        <w:rPr>
+          <w:rFonts w:ascii="Calibri" w:hAnsi="Calibri" w:eastAsia="Microsoft YaHei" w:cs="Calibri"/>
+        </w:rPr>
+        <w:t xml:space="preserve">10. gem5 Ruby directed test generators（官方源码）. &lt;https://raw.githubusercontent.com/gem5/gem5/stable/src/cpu/testers/directedtest/InvalidateGenerator.cc&gt;</w:t>
+      </w:r>
+    </w:p>
+    <w:p>
+      <w:pPr>
+        <w:ind w:left="0" w:firstLine="420"/>
+      </w:pPr>
+      <w:r>
+        <w:rPr>
+          <w:rFonts w:ascii="Calibri" w:hAnsi="Calibri" w:eastAsia="Microsoft YaHei" w:cs="Calibri"/>
+        </w:rPr>
+        <w:t xml:space="preserve">11. gem5 Ruby Random Tester（官方文档）. &lt;https://www.gem5.org/documentation/general_docs/debugging_and_testing/directed_testers/ruby_random_tester/&gt;</w:t>
+      </w:r>
+    </w:p>
     <w:sectPr>
       <w:titlePg/>
       <w:footerReference w:type="first" r:id="rIdFirstFooter"/>

</xml_diff>